<commit_message>
finish system design document
</commit_message>
<xml_diff>
--- a/project-files/milestone-1/ACAFAX-System-Design.docx
+++ b/project-files/milestone-1/ACAFAX-System-Design.docx
@@ -240,764 +240,2010 @@
         <w:t>Dr. Siddhartha Bhattacharya</w:t>
       </w:r>
     </w:p>
-    <w:p>
-      <w:pPr>
-        <w:pBdr>
-          <w:bottom w:val="single" w:sz="4" w:space="1" w:color="auto"/>
-        </w:pBdr>
-        <w:spacing w:line="240" w:lineRule="auto"/>
-        <w:jc w:val="center"/>
+    <w:sdt>
+      <w:sdtPr>
+        <w:id w:val="-1753037603"/>
+        <w:docPartObj>
+          <w:docPartGallery w:val="Table of Contents"/>
+          <w:docPartUnique/>
+        </w:docPartObj>
+      </w:sdtPr>
+      <w:sdtEndPr>
+        <w:rPr>
+          <w:rFonts w:asciiTheme="minorHAnsi" w:eastAsiaTheme="minorHAnsi" w:hAnsiTheme="minorHAnsi" w:cstheme="minorBidi"/>
+          <w:b/>
+          <w:bCs/>
+          <w:noProof/>
+          <w:color w:val="auto"/>
+          <w:kern w:val="2"/>
+          <w:sz w:val="24"/>
+          <w:szCs w:val="24"/>
+          <w14:ligatures w14:val="standardContextual"/>
+        </w:rPr>
+      </w:sdtEndPr>
+      <w:sdtContent>
+        <w:p>
+          <w:pPr>
+            <w:pStyle w:val="TOCHeading"/>
+          </w:pPr>
+          <w:r>
+            <w:t>Table of Contents</w:t>
+          </w:r>
+        </w:p>
+        <w:p>
+          <w:pPr>
+            <w:pStyle w:val="TOC1"/>
+            <w:tabs>
+              <w:tab w:val="left" w:pos="480"/>
+              <w:tab w:val="right" w:leader="dot" w:pos="9350"/>
+            </w:tabs>
+            <w:rPr>
+              <w:rFonts w:eastAsiaTheme="minorEastAsia"/>
+              <w:noProof/>
+            </w:rPr>
+          </w:pPr>
+          <w:r>
+            <w:fldChar w:fldCharType="begin"/>
+          </w:r>
+          <w:r>
+            <w:instrText xml:space="preserve"> TOC \o "1-3" \h \z \u </w:instrText>
+          </w:r>
+          <w:r>
+            <w:fldChar w:fldCharType="separate"/>
+          </w:r>
+          <w:hyperlink w:anchor="_Toc241079956" w:history="1">
+            <w:r>
+              <w:rPr>
+                <w:rStyle w:val="Hyperlink"/>
+                <w:noProof/>
+              </w:rPr>
+              <w:t>1.</w:t>
+            </w:r>
+            <w:r>
+              <w:rPr>
+                <w:rFonts w:eastAsiaTheme="minorEastAsia"/>
+                <w:noProof/>
+              </w:rPr>
+              <w:tab/>
+            </w:r>
+            <w:r>
+              <w:rPr>
+                <w:rStyle w:val="Hyperlink"/>
+                <w:noProof/>
+              </w:rPr>
+              <w:t>Introduction</w:t>
+            </w:r>
+            <w:r>
+              <w:rPr>
+                <w:noProof/>
+                <w:webHidden/>
+              </w:rPr>
+              <w:tab/>
+            </w:r>
+            <w:r>
+              <w:rPr>
+                <w:noProof/>
+                <w:webHidden/>
+              </w:rPr>
+              <w:fldChar w:fldCharType="begin"/>
+            </w:r>
+            <w:r>
+              <w:rPr>
+                <w:noProof/>
+                <w:webHidden/>
+              </w:rPr>
+              <w:instrText xml:space="preserve"> PAGEREF _Toc241079956 \h </w:instrText>
+            </w:r>
+            <w:r>
+              <w:rPr>
+                <w:noProof/>
+                <w:webHidden/>
+              </w:rPr>
+            </w:r>
+            <w:r>
+              <w:rPr>
+                <w:noProof/>
+                <w:webHidden/>
+              </w:rPr>
+              <w:fldChar w:fldCharType="separate"/>
+            </w:r>
+            <w:r>
+              <w:rPr>
+                <w:noProof/>
+                <w:webHidden/>
+              </w:rPr>
+              <w:t>3</w:t>
+            </w:r>
+            <w:r>
+              <w:rPr>
+                <w:noProof/>
+                <w:webHidden/>
+              </w:rPr>
+              <w:fldChar w:fldCharType="end"/>
+            </w:r>
+          </w:hyperlink>
+        </w:p>
+        <w:p>
+          <w:pPr>
+            <w:pStyle w:val="TOC2"/>
+            <w:tabs>
+              <w:tab w:val="left" w:pos="960"/>
+              <w:tab w:val="right" w:leader="dot" w:pos="9350"/>
+            </w:tabs>
+            <w:rPr>
+              <w:rFonts w:eastAsiaTheme="minorEastAsia"/>
+              <w:noProof/>
+            </w:rPr>
+          </w:pPr>
+          <w:hyperlink w:anchor="_Toc241079957" w:history="1">
+            <w:r>
+              <w:rPr>
+                <w:rStyle w:val="Hyperlink"/>
+                <w:noProof/>
+              </w:rPr>
+              <w:t>1.1.</w:t>
+            </w:r>
+            <w:r>
+              <w:rPr>
+                <w:rFonts w:eastAsiaTheme="minorEastAsia"/>
+                <w:noProof/>
+              </w:rPr>
+              <w:tab/>
+            </w:r>
+            <w:r>
+              <w:rPr>
+                <w:rStyle w:val="Hyperlink"/>
+                <w:noProof/>
+              </w:rPr>
+              <w:t>Purpose</w:t>
+            </w:r>
+            <w:r>
+              <w:rPr>
+                <w:noProof/>
+                <w:webHidden/>
+              </w:rPr>
+              <w:tab/>
+            </w:r>
+            <w:r>
+              <w:rPr>
+                <w:noProof/>
+                <w:webHidden/>
+              </w:rPr>
+              <w:fldChar w:fldCharType="begin"/>
+            </w:r>
+            <w:r>
+              <w:rPr>
+                <w:noProof/>
+                <w:webHidden/>
+              </w:rPr>
+              <w:instrText xml:space="preserve"> PAGEREF _Toc241079957 \h </w:instrText>
+            </w:r>
+            <w:r>
+              <w:rPr>
+                <w:noProof/>
+                <w:webHidden/>
+              </w:rPr>
+            </w:r>
+            <w:r>
+              <w:rPr>
+                <w:noProof/>
+                <w:webHidden/>
+              </w:rPr>
+              <w:fldChar w:fldCharType="separate"/>
+            </w:r>
+            <w:r>
+              <w:rPr>
+                <w:noProof/>
+                <w:webHidden/>
+              </w:rPr>
+              <w:t>3</w:t>
+            </w:r>
+            <w:r>
+              <w:rPr>
+                <w:noProof/>
+                <w:webHidden/>
+              </w:rPr>
+              <w:fldChar w:fldCharType="end"/>
+            </w:r>
+          </w:hyperlink>
+        </w:p>
+        <w:p>
+          <w:pPr>
+            <w:pStyle w:val="TOC2"/>
+            <w:tabs>
+              <w:tab w:val="left" w:pos="960"/>
+              <w:tab w:val="right" w:leader="dot" w:pos="9350"/>
+            </w:tabs>
+            <w:rPr>
+              <w:rFonts w:eastAsiaTheme="minorEastAsia"/>
+              <w:noProof/>
+            </w:rPr>
+          </w:pPr>
+          <w:hyperlink w:anchor="_Toc241079958" w:history="1">
+            <w:r>
+              <w:rPr>
+                <w:rStyle w:val="Hyperlink"/>
+                <w:noProof/>
+              </w:rPr>
+              <w:t>1.2.</w:t>
+            </w:r>
+            <w:r>
+              <w:rPr>
+                <w:rFonts w:eastAsiaTheme="minorEastAsia"/>
+                <w:noProof/>
+              </w:rPr>
+              <w:tab/>
+            </w:r>
+            <w:r>
+              <w:rPr>
+                <w:rStyle w:val="Hyperlink"/>
+                <w:noProof/>
+              </w:rPr>
+              <w:t>Scope</w:t>
+            </w:r>
+            <w:r>
+              <w:rPr>
+                <w:noProof/>
+                <w:webHidden/>
+              </w:rPr>
+              <w:tab/>
+            </w:r>
+            <w:r>
+              <w:rPr>
+                <w:noProof/>
+                <w:webHidden/>
+              </w:rPr>
+              <w:fldChar w:fldCharType="begin"/>
+            </w:r>
+            <w:r>
+              <w:rPr>
+                <w:noProof/>
+                <w:webHidden/>
+              </w:rPr>
+              <w:instrText xml:space="preserve"> PAGEREF _Toc241079958 \h </w:instrText>
+            </w:r>
+            <w:r>
+              <w:rPr>
+                <w:noProof/>
+                <w:webHidden/>
+              </w:rPr>
+            </w:r>
+            <w:r>
+              <w:rPr>
+                <w:noProof/>
+                <w:webHidden/>
+              </w:rPr>
+              <w:fldChar w:fldCharType="separate"/>
+            </w:r>
+            <w:r>
+              <w:rPr>
+                <w:noProof/>
+                <w:webHidden/>
+              </w:rPr>
+              <w:t>3</w:t>
+            </w:r>
+            <w:r>
+              <w:rPr>
+                <w:noProof/>
+                <w:webHidden/>
+              </w:rPr>
+              <w:fldChar w:fldCharType="end"/>
+            </w:r>
+          </w:hyperlink>
+        </w:p>
+        <w:p>
+          <w:pPr>
+            <w:pStyle w:val="TOC2"/>
+            <w:tabs>
+              <w:tab w:val="left" w:pos="960"/>
+              <w:tab w:val="right" w:leader="dot" w:pos="9350"/>
+            </w:tabs>
+            <w:rPr>
+              <w:rFonts w:eastAsiaTheme="minorEastAsia"/>
+              <w:noProof/>
+            </w:rPr>
+          </w:pPr>
+          <w:hyperlink w:anchor="_Toc241079959" w:history="1">
+            <w:r>
+              <w:rPr>
+                <w:rStyle w:val="Hyperlink"/>
+                <w:noProof/>
+              </w:rPr>
+              <w:t>1.3.</w:t>
+            </w:r>
+            <w:r>
+              <w:rPr>
+                <w:rFonts w:eastAsiaTheme="minorEastAsia"/>
+                <w:noProof/>
+              </w:rPr>
+              <w:tab/>
+            </w:r>
+            <w:r>
+              <w:rPr>
+                <w:rStyle w:val="Hyperlink"/>
+                <w:noProof/>
+              </w:rPr>
+              <w:t>Intended Audience</w:t>
+            </w:r>
+            <w:r>
+              <w:rPr>
+                <w:noProof/>
+                <w:webHidden/>
+              </w:rPr>
+              <w:tab/>
+            </w:r>
+            <w:r>
+              <w:rPr>
+                <w:noProof/>
+                <w:webHidden/>
+              </w:rPr>
+              <w:fldChar w:fldCharType="begin"/>
+            </w:r>
+            <w:r>
+              <w:rPr>
+                <w:noProof/>
+                <w:webHidden/>
+              </w:rPr>
+              <w:instrText xml:space="preserve"> PAGEREF _Toc241079959 \h </w:instrText>
+            </w:r>
+            <w:r>
+              <w:rPr>
+                <w:noProof/>
+                <w:webHidden/>
+              </w:rPr>
+            </w:r>
+            <w:r>
+              <w:rPr>
+                <w:noProof/>
+                <w:webHidden/>
+              </w:rPr>
+              <w:fldChar w:fldCharType="separate"/>
+            </w:r>
+            <w:r>
+              <w:rPr>
+                <w:noProof/>
+                <w:webHidden/>
+              </w:rPr>
+              <w:t>3</w:t>
+            </w:r>
+            <w:r>
+              <w:rPr>
+                <w:noProof/>
+                <w:webHidden/>
+              </w:rPr>
+              <w:fldChar w:fldCharType="end"/>
+            </w:r>
+          </w:hyperlink>
+        </w:p>
+        <w:p>
+          <w:pPr>
+            <w:pStyle w:val="TOC1"/>
+            <w:tabs>
+              <w:tab w:val="left" w:pos="480"/>
+              <w:tab w:val="right" w:leader="dot" w:pos="9350"/>
+            </w:tabs>
+            <w:rPr>
+              <w:rFonts w:eastAsiaTheme="minorEastAsia"/>
+              <w:noProof/>
+            </w:rPr>
+          </w:pPr>
+          <w:hyperlink w:anchor="_Toc241079960" w:history="1">
+            <w:r>
+              <w:rPr>
+                <w:rStyle w:val="Hyperlink"/>
+                <w:noProof/>
+              </w:rPr>
+              <w:t>2.</w:t>
+            </w:r>
+            <w:r>
+              <w:rPr>
+                <w:rFonts w:eastAsiaTheme="minorEastAsia"/>
+                <w:noProof/>
+              </w:rPr>
+              <w:tab/>
+            </w:r>
+            <w:r>
+              <w:rPr>
+                <w:rStyle w:val="Hyperlink"/>
+                <w:noProof/>
+              </w:rPr>
+              <w:t>Definitions and Acronyms</w:t>
+            </w:r>
+            <w:r>
+              <w:rPr>
+                <w:noProof/>
+                <w:webHidden/>
+              </w:rPr>
+              <w:tab/>
+            </w:r>
+            <w:r>
+              <w:rPr>
+                <w:noProof/>
+                <w:webHidden/>
+              </w:rPr>
+              <w:fldChar w:fldCharType="begin"/>
+            </w:r>
+            <w:r>
+              <w:rPr>
+                <w:noProof/>
+                <w:webHidden/>
+              </w:rPr>
+              <w:instrText xml:space="preserve"> PAGEREF _Toc241079960 \h </w:instrText>
+            </w:r>
+            <w:r>
+              <w:rPr>
+                <w:noProof/>
+                <w:webHidden/>
+              </w:rPr>
+            </w:r>
+            <w:r>
+              <w:rPr>
+                <w:noProof/>
+                <w:webHidden/>
+              </w:rPr>
+              <w:fldChar w:fldCharType="separate"/>
+            </w:r>
+            <w:r>
+              <w:rPr>
+                <w:noProof/>
+                <w:webHidden/>
+              </w:rPr>
+              <w:t>4</w:t>
+            </w:r>
+            <w:r>
+              <w:rPr>
+                <w:noProof/>
+                <w:webHidden/>
+              </w:rPr>
+              <w:fldChar w:fldCharType="end"/>
+            </w:r>
+          </w:hyperlink>
+        </w:p>
+        <w:p>
+          <w:pPr>
+            <w:pStyle w:val="TOC1"/>
+            <w:tabs>
+              <w:tab w:val="left" w:pos="480"/>
+              <w:tab w:val="right" w:leader="dot" w:pos="9350"/>
+            </w:tabs>
+            <w:rPr>
+              <w:rFonts w:eastAsiaTheme="minorEastAsia"/>
+              <w:noProof/>
+            </w:rPr>
+          </w:pPr>
+          <w:hyperlink w:anchor="_Toc241079961" w:history="1">
+            <w:r>
+              <w:rPr>
+                <w:rStyle w:val="Hyperlink"/>
+                <w:noProof/>
+              </w:rPr>
+              <w:t>3.</w:t>
+            </w:r>
+            <w:r>
+              <w:rPr>
+                <w:rFonts w:eastAsiaTheme="minorEastAsia"/>
+                <w:noProof/>
+              </w:rPr>
+              <w:tab/>
+            </w:r>
+            <w:r>
+              <w:rPr>
+                <w:rStyle w:val="Hyperlink"/>
+                <w:noProof/>
+              </w:rPr>
+              <w:t>System Design</w:t>
+            </w:r>
+            <w:r>
+              <w:rPr>
+                <w:noProof/>
+                <w:webHidden/>
+              </w:rPr>
+              <w:tab/>
+            </w:r>
+            <w:r>
+              <w:rPr>
+                <w:noProof/>
+                <w:webHidden/>
+              </w:rPr>
+              <w:fldChar w:fldCharType="begin"/>
+            </w:r>
+            <w:r>
+              <w:rPr>
+                <w:noProof/>
+                <w:webHidden/>
+              </w:rPr>
+              <w:instrText xml:space="preserve"> PAGEREF _Toc241079961 \h </w:instrText>
+            </w:r>
+            <w:r>
+              <w:rPr>
+                <w:noProof/>
+                <w:webHidden/>
+              </w:rPr>
+            </w:r>
+            <w:r>
+              <w:rPr>
+                <w:noProof/>
+                <w:webHidden/>
+              </w:rPr>
+              <w:fldChar w:fldCharType="separate"/>
+            </w:r>
+            <w:r>
+              <w:rPr>
+                <w:noProof/>
+                <w:webHidden/>
+              </w:rPr>
+              <w:t>5</w:t>
+            </w:r>
+            <w:r>
+              <w:rPr>
+                <w:noProof/>
+                <w:webHidden/>
+              </w:rPr>
+              <w:fldChar w:fldCharType="end"/>
+            </w:r>
+          </w:hyperlink>
+        </w:p>
+        <w:p>
+          <w:pPr>
+            <w:pStyle w:val="TOC2"/>
+            <w:tabs>
+              <w:tab w:val="left" w:pos="960"/>
+              <w:tab w:val="right" w:leader="dot" w:pos="9350"/>
+            </w:tabs>
+            <w:rPr>
+              <w:rFonts w:eastAsiaTheme="minorEastAsia"/>
+              <w:noProof/>
+            </w:rPr>
+          </w:pPr>
+          <w:hyperlink w:anchor="_Toc241079962" w:history="1">
+            <w:r>
+              <w:rPr>
+                <w:rStyle w:val="Hyperlink"/>
+                <w:noProof/>
+              </w:rPr>
+              <w:t>3.1.</w:t>
+            </w:r>
+            <w:r>
+              <w:rPr>
+                <w:rFonts w:eastAsiaTheme="minorEastAsia"/>
+                <w:noProof/>
+              </w:rPr>
+              <w:tab/>
+            </w:r>
+            <w:r>
+              <w:rPr>
+                <w:rStyle w:val="Hyperlink"/>
+                <w:noProof/>
+              </w:rPr>
+              <w:t>Design Overview</w:t>
+            </w:r>
+            <w:r>
+              <w:rPr>
+                <w:noProof/>
+                <w:webHidden/>
+              </w:rPr>
+              <w:tab/>
+            </w:r>
+            <w:r>
+              <w:rPr>
+                <w:noProof/>
+                <w:webHidden/>
+              </w:rPr>
+              <w:fldChar w:fldCharType="begin"/>
+            </w:r>
+            <w:r>
+              <w:rPr>
+                <w:noProof/>
+                <w:webHidden/>
+              </w:rPr>
+              <w:instrText xml:space="preserve"> PAGEREF _Toc241079962 \h </w:instrText>
+            </w:r>
+            <w:r>
+              <w:rPr>
+                <w:noProof/>
+                <w:webHidden/>
+              </w:rPr>
+            </w:r>
+            <w:r>
+              <w:rPr>
+                <w:noProof/>
+                <w:webHidden/>
+              </w:rPr>
+              <w:fldChar w:fldCharType="separate"/>
+            </w:r>
+            <w:r>
+              <w:rPr>
+                <w:noProof/>
+                <w:webHidden/>
+              </w:rPr>
+              <w:t>5</w:t>
+            </w:r>
+            <w:r>
+              <w:rPr>
+                <w:noProof/>
+                <w:webHidden/>
+              </w:rPr>
+              <w:fldChar w:fldCharType="end"/>
+            </w:r>
+          </w:hyperlink>
+        </w:p>
+        <w:p>
+          <w:pPr>
+            <w:pStyle w:val="TOC2"/>
+            <w:tabs>
+              <w:tab w:val="left" w:pos="960"/>
+              <w:tab w:val="right" w:leader="dot" w:pos="9350"/>
+            </w:tabs>
+            <w:rPr>
+              <w:rFonts w:eastAsiaTheme="minorEastAsia"/>
+              <w:noProof/>
+            </w:rPr>
+          </w:pPr>
+          <w:hyperlink w:anchor="_Toc241079963" w:history="1">
+            <w:r>
+              <w:rPr>
+                <w:rStyle w:val="Hyperlink"/>
+                <w:noProof/>
+              </w:rPr>
+              <w:t>3.2.</w:t>
+            </w:r>
+            <w:r>
+              <w:rPr>
+                <w:rFonts w:eastAsiaTheme="minorEastAsia"/>
+                <w:noProof/>
+              </w:rPr>
+              <w:tab/>
+            </w:r>
+            <w:r>
+              <w:rPr>
+                <w:rStyle w:val="Hyperlink"/>
+                <w:noProof/>
+              </w:rPr>
+              <w:t>System Architecture</w:t>
+            </w:r>
+            <w:r>
+              <w:rPr>
+                <w:noProof/>
+                <w:webHidden/>
+              </w:rPr>
+              <w:tab/>
+            </w:r>
+            <w:r>
+              <w:rPr>
+                <w:noProof/>
+                <w:webHidden/>
+              </w:rPr>
+              <w:fldChar w:fldCharType="begin"/>
+            </w:r>
+            <w:r>
+              <w:rPr>
+                <w:noProof/>
+                <w:webHidden/>
+              </w:rPr>
+              <w:instrText xml:space="preserve"> PAGEREF _Toc241079963 \h </w:instrText>
+            </w:r>
+            <w:r>
+              <w:rPr>
+                <w:noProof/>
+                <w:webHidden/>
+              </w:rPr>
+            </w:r>
+            <w:r>
+              <w:rPr>
+                <w:noProof/>
+                <w:webHidden/>
+              </w:rPr>
+              <w:fldChar w:fldCharType="separate"/>
+            </w:r>
+            <w:r>
+              <w:rPr>
+                <w:noProof/>
+                <w:webHidden/>
+              </w:rPr>
+              <w:t>6</w:t>
+            </w:r>
+            <w:r>
+              <w:rPr>
+                <w:noProof/>
+                <w:webHidden/>
+              </w:rPr>
+              <w:fldChar w:fldCharType="end"/>
+            </w:r>
+          </w:hyperlink>
+        </w:p>
+        <w:p>
+          <w:pPr>
+            <w:pStyle w:val="TOC1"/>
+            <w:tabs>
+              <w:tab w:val="left" w:pos="480"/>
+              <w:tab w:val="right" w:leader="dot" w:pos="9350"/>
+            </w:tabs>
+            <w:rPr>
+              <w:rFonts w:eastAsiaTheme="minorEastAsia"/>
+              <w:noProof/>
+            </w:rPr>
+          </w:pPr>
+          <w:hyperlink w:anchor="_Toc241079964" w:history="1">
+            <w:r>
+              <w:rPr>
+                <w:rStyle w:val="Hyperlink"/>
+                <w:noProof/>
+              </w:rPr>
+              <w:t>4.</w:t>
+            </w:r>
+            <w:r>
+              <w:rPr>
+                <w:rFonts w:eastAsiaTheme="minorEastAsia"/>
+                <w:noProof/>
+              </w:rPr>
+              <w:tab/>
+            </w:r>
+            <w:r>
+              <w:rPr>
+                <w:rStyle w:val="Hyperlink"/>
+                <w:noProof/>
+              </w:rPr>
+              <w:t>Component Design</w:t>
+            </w:r>
+            <w:r>
+              <w:rPr>
+                <w:noProof/>
+                <w:webHidden/>
+              </w:rPr>
+              <w:tab/>
+            </w:r>
+            <w:r>
+              <w:rPr>
+                <w:noProof/>
+                <w:webHidden/>
+              </w:rPr>
+              <w:fldChar w:fldCharType="begin"/>
+            </w:r>
+            <w:r>
+              <w:rPr>
+                <w:noProof/>
+                <w:webHidden/>
+              </w:rPr>
+              <w:instrText xml:space="preserve"> PAGEREF _Toc241079964 \h </w:instrText>
+            </w:r>
+            <w:r>
+              <w:rPr>
+                <w:noProof/>
+                <w:webHidden/>
+              </w:rPr>
+            </w:r>
+            <w:r>
+              <w:rPr>
+                <w:noProof/>
+                <w:webHidden/>
+              </w:rPr>
+              <w:fldChar w:fldCharType="separate"/>
+            </w:r>
+            <w:r>
+              <w:rPr>
+                <w:noProof/>
+                <w:webHidden/>
+              </w:rPr>
+              <w:t>6</w:t>
+            </w:r>
+            <w:r>
+              <w:rPr>
+                <w:noProof/>
+                <w:webHidden/>
+              </w:rPr>
+              <w:fldChar w:fldCharType="end"/>
+            </w:r>
+          </w:hyperlink>
+        </w:p>
+        <w:p>
+          <w:pPr>
+            <w:pStyle w:val="TOC2"/>
+            <w:tabs>
+              <w:tab w:val="left" w:pos="960"/>
+              <w:tab w:val="right" w:leader="dot" w:pos="9350"/>
+            </w:tabs>
+            <w:rPr>
+              <w:rFonts w:eastAsiaTheme="minorEastAsia"/>
+              <w:noProof/>
+            </w:rPr>
+          </w:pPr>
+          <w:hyperlink w:anchor="_Toc241079965" w:history="1">
+            <w:r>
+              <w:rPr>
+                <w:rStyle w:val="Hyperlink"/>
+                <w:noProof/>
+              </w:rPr>
+              <w:t>4.1.</w:t>
+            </w:r>
+            <w:r>
+              <w:rPr>
+                <w:rFonts w:eastAsiaTheme="minorEastAsia"/>
+                <w:noProof/>
+              </w:rPr>
+              <w:tab/>
+            </w:r>
+            <w:r>
+              <w:rPr>
+                <w:rStyle w:val="Hyperlink"/>
+                <w:noProof/>
+              </w:rPr>
+              <w:t>CCAT</w:t>
+            </w:r>
+            <w:r>
+              <w:rPr>
+                <w:noProof/>
+                <w:webHidden/>
+              </w:rPr>
+              <w:tab/>
+            </w:r>
+            <w:r>
+              <w:rPr>
+                <w:noProof/>
+                <w:webHidden/>
+              </w:rPr>
+              <w:fldChar w:fldCharType="begin"/>
+            </w:r>
+            <w:r>
+              <w:rPr>
+                <w:noProof/>
+                <w:webHidden/>
+              </w:rPr>
+              <w:instrText xml:space="preserve"> PAGEREF _Toc241079965 \h </w:instrText>
+            </w:r>
+            <w:r>
+              <w:rPr>
+                <w:noProof/>
+                <w:webHidden/>
+              </w:rPr>
+            </w:r>
+            <w:r>
+              <w:rPr>
+                <w:noProof/>
+                <w:webHidden/>
+              </w:rPr>
+              <w:fldChar w:fldCharType="separate"/>
+            </w:r>
+            <w:r>
+              <w:rPr>
+                <w:noProof/>
+                <w:webHidden/>
+              </w:rPr>
+              <w:t>6</w:t>
+            </w:r>
+            <w:r>
+              <w:rPr>
+                <w:noProof/>
+                <w:webHidden/>
+              </w:rPr>
+              <w:fldChar w:fldCharType="end"/>
+            </w:r>
+          </w:hyperlink>
+        </w:p>
+        <w:p>
+          <w:pPr>
+            <w:pStyle w:val="TOC3"/>
+            <w:tabs>
+              <w:tab w:val="left" w:pos="1200"/>
+              <w:tab w:val="right" w:leader="dot" w:pos="9350"/>
+            </w:tabs>
+            <w:rPr>
+              <w:rFonts w:eastAsiaTheme="minorEastAsia"/>
+              <w:noProof/>
+            </w:rPr>
+          </w:pPr>
+          <w:hyperlink w:anchor="_Toc241079966" w:history="1">
+            <w:r>
+              <w:rPr>
+                <w:rStyle w:val="Hyperlink"/>
+                <w:noProof/>
+              </w:rPr>
+              <w:t>4.2.</w:t>
+            </w:r>
+            <w:r>
+              <w:rPr>
+                <w:rFonts w:eastAsiaTheme="minorEastAsia"/>
+                <w:noProof/>
+              </w:rPr>
+              <w:tab/>
+            </w:r>
+            <w:r>
+              <w:rPr>
+                <w:rStyle w:val="Hyperlink"/>
+                <w:noProof/>
+              </w:rPr>
+              <w:t>Soar Agent</w:t>
+            </w:r>
+            <w:r>
+              <w:rPr>
+                <w:noProof/>
+                <w:webHidden/>
+              </w:rPr>
+              <w:tab/>
+            </w:r>
+            <w:r>
+              <w:rPr>
+                <w:noProof/>
+                <w:webHidden/>
+              </w:rPr>
+              <w:fldChar w:fldCharType="begin"/>
+            </w:r>
+            <w:r>
+              <w:rPr>
+                <w:noProof/>
+                <w:webHidden/>
+              </w:rPr>
+              <w:instrText xml:space="preserve"> PAGEREF _Toc241079966 \h </w:instrText>
+            </w:r>
+            <w:r>
+              <w:rPr>
+                <w:noProof/>
+                <w:webHidden/>
+              </w:rPr>
+            </w:r>
+            <w:r>
+              <w:rPr>
+                <w:noProof/>
+                <w:webHidden/>
+              </w:rPr>
+              <w:fldChar w:fldCharType="separate"/>
+            </w:r>
+            <w:r>
+              <w:rPr>
+                <w:noProof/>
+                <w:webHidden/>
+              </w:rPr>
+              <w:t>6</w:t>
+            </w:r>
+            <w:r>
+              <w:rPr>
+                <w:noProof/>
+                <w:webHidden/>
+              </w:rPr>
+              <w:fldChar w:fldCharType="end"/>
+            </w:r>
+          </w:hyperlink>
+        </w:p>
+        <w:p>
+          <w:pPr>
+            <w:pStyle w:val="TOC3"/>
+            <w:tabs>
+              <w:tab w:val="left" w:pos="1200"/>
+              <w:tab w:val="right" w:leader="dot" w:pos="9350"/>
+            </w:tabs>
+            <w:rPr>
+              <w:rFonts w:eastAsiaTheme="minorEastAsia"/>
+              <w:noProof/>
+            </w:rPr>
+          </w:pPr>
+          <w:hyperlink w:anchor="_Toc241079967" w:history="1">
+            <w:r>
+              <w:rPr>
+                <w:rStyle w:val="Hyperlink"/>
+                <w:noProof/>
+              </w:rPr>
+              <w:t>4.3.</w:t>
+            </w:r>
+            <w:r>
+              <w:rPr>
+                <w:rFonts w:eastAsiaTheme="minorEastAsia"/>
+                <w:noProof/>
+              </w:rPr>
+              <w:tab/>
+            </w:r>
+            <w:r>
+              <w:rPr>
+                <w:rStyle w:val="Hyperlink"/>
+                <w:noProof/>
+              </w:rPr>
+              <w:t>GUI</w:t>
+            </w:r>
+            <w:r>
+              <w:rPr>
+                <w:noProof/>
+                <w:webHidden/>
+              </w:rPr>
+              <w:tab/>
+            </w:r>
+            <w:r>
+              <w:rPr>
+                <w:noProof/>
+                <w:webHidden/>
+              </w:rPr>
+              <w:fldChar w:fldCharType="begin"/>
+            </w:r>
+            <w:r>
+              <w:rPr>
+                <w:noProof/>
+                <w:webHidden/>
+              </w:rPr>
+              <w:instrText xml:space="preserve"> PAGEREF _Toc241079967 \h </w:instrText>
+            </w:r>
+            <w:r>
+              <w:rPr>
+                <w:noProof/>
+                <w:webHidden/>
+              </w:rPr>
+            </w:r>
+            <w:r>
+              <w:rPr>
+                <w:noProof/>
+                <w:webHidden/>
+              </w:rPr>
+              <w:fldChar w:fldCharType="separate"/>
+            </w:r>
+            <w:r>
+              <w:rPr>
+                <w:noProof/>
+                <w:webHidden/>
+              </w:rPr>
+              <w:t>7</w:t>
+            </w:r>
+            <w:r>
+              <w:rPr>
+                <w:noProof/>
+                <w:webHidden/>
+              </w:rPr>
+              <w:fldChar w:fldCharType="end"/>
+            </w:r>
+          </w:hyperlink>
+        </w:p>
+        <w:p>
+          <w:pPr>
+            <w:pStyle w:val="TOC3"/>
+            <w:tabs>
+              <w:tab w:val="left" w:pos="1200"/>
+              <w:tab w:val="right" w:leader="dot" w:pos="9350"/>
+            </w:tabs>
+            <w:rPr>
+              <w:rFonts w:eastAsiaTheme="minorEastAsia"/>
+              <w:noProof/>
+            </w:rPr>
+          </w:pPr>
+          <w:hyperlink w:anchor="_Toc241079968" w:history="1">
+            <w:r>
+              <w:rPr>
+                <w:rStyle w:val="Hyperlink"/>
+                <w:noProof/>
+              </w:rPr>
+              <w:t>4.4.</w:t>
+            </w:r>
+            <w:r>
+              <w:rPr>
+                <w:rFonts w:eastAsiaTheme="minorEastAsia"/>
+                <w:noProof/>
+              </w:rPr>
+              <w:tab/>
+            </w:r>
+            <w:r>
+              <w:rPr>
+                <w:rStyle w:val="Hyperlink"/>
+                <w:noProof/>
+              </w:rPr>
+              <w:t>Datarefs</w:t>
+            </w:r>
+            <w:r>
+              <w:rPr>
+                <w:noProof/>
+                <w:webHidden/>
+              </w:rPr>
+              <w:tab/>
+            </w:r>
+            <w:r>
+              <w:rPr>
+                <w:noProof/>
+                <w:webHidden/>
+              </w:rPr>
+              <w:fldChar w:fldCharType="begin"/>
+            </w:r>
+            <w:r>
+              <w:rPr>
+                <w:noProof/>
+                <w:webHidden/>
+              </w:rPr>
+              <w:instrText xml:space="preserve"> PAGEREF _Toc241079968 \h </w:instrText>
+            </w:r>
+            <w:r>
+              <w:rPr>
+                <w:noProof/>
+                <w:webHidden/>
+              </w:rPr>
+            </w:r>
+            <w:r>
+              <w:rPr>
+                <w:noProof/>
+                <w:webHidden/>
+              </w:rPr>
+              <w:fldChar w:fldCharType="separate"/>
+            </w:r>
+            <w:r>
+              <w:rPr>
+                <w:noProof/>
+                <w:webHidden/>
+              </w:rPr>
+              <w:t>7</w:t>
+            </w:r>
+            <w:r>
+              <w:rPr>
+                <w:noProof/>
+                <w:webHidden/>
+              </w:rPr>
+              <w:fldChar w:fldCharType="end"/>
+            </w:r>
+          </w:hyperlink>
+        </w:p>
+        <w:p>
+          <w:pPr>
+            <w:pStyle w:val="TOC1"/>
+            <w:tabs>
+              <w:tab w:val="left" w:pos="480"/>
+              <w:tab w:val="right" w:leader="dot" w:pos="9350"/>
+            </w:tabs>
+            <w:rPr>
+              <w:rFonts w:eastAsiaTheme="minorEastAsia"/>
+              <w:noProof/>
+            </w:rPr>
+          </w:pPr>
+          <w:hyperlink w:anchor="_Toc241079969" w:history="1">
+            <w:r>
+              <w:rPr>
+                <w:rStyle w:val="Hyperlink"/>
+                <w:noProof/>
+              </w:rPr>
+              <w:t>5.</w:t>
+            </w:r>
+            <w:r>
+              <w:rPr>
+                <w:rFonts w:eastAsiaTheme="minorEastAsia"/>
+                <w:noProof/>
+              </w:rPr>
+              <w:tab/>
+            </w:r>
+            <w:r>
+              <w:rPr>
+                <w:rStyle w:val="Hyperlink"/>
+                <w:noProof/>
+              </w:rPr>
+              <w:t>User Interface Design</w:t>
+            </w:r>
+            <w:r>
+              <w:rPr>
+                <w:noProof/>
+                <w:webHidden/>
+              </w:rPr>
+              <w:tab/>
+            </w:r>
+            <w:r>
+              <w:rPr>
+                <w:noProof/>
+                <w:webHidden/>
+              </w:rPr>
+              <w:fldChar w:fldCharType="begin"/>
+            </w:r>
+            <w:r>
+              <w:rPr>
+                <w:noProof/>
+                <w:webHidden/>
+              </w:rPr>
+              <w:instrText xml:space="preserve"> PAGEREF _Toc241079969 \h </w:instrText>
+            </w:r>
+            <w:r>
+              <w:rPr>
+                <w:noProof/>
+                <w:webHidden/>
+              </w:rPr>
+            </w:r>
+            <w:r>
+              <w:rPr>
+                <w:noProof/>
+                <w:webHidden/>
+              </w:rPr>
+              <w:fldChar w:fldCharType="separate"/>
+            </w:r>
+            <w:r>
+              <w:rPr>
+                <w:noProof/>
+                <w:webHidden/>
+              </w:rPr>
+              <w:t>7</w:t>
+            </w:r>
+            <w:r>
+              <w:rPr>
+                <w:noProof/>
+                <w:webHidden/>
+              </w:rPr>
+              <w:fldChar w:fldCharType="end"/>
+            </w:r>
+          </w:hyperlink>
+        </w:p>
+        <w:p>
+          <w:pPr>
+            <w:pStyle w:val="TOC2"/>
+            <w:tabs>
+              <w:tab w:val="left" w:pos="960"/>
+              <w:tab w:val="right" w:leader="dot" w:pos="9350"/>
+            </w:tabs>
+            <w:rPr>
+              <w:rFonts w:eastAsiaTheme="minorEastAsia"/>
+              <w:noProof/>
+            </w:rPr>
+          </w:pPr>
+          <w:hyperlink w:anchor="_Toc241079970" w:history="1">
+            <w:r>
+              <w:rPr>
+                <w:rStyle w:val="Hyperlink"/>
+                <w:noProof/>
+              </w:rPr>
+              <w:t>5.1.</w:t>
+            </w:r>
+            <w:r>
+              <w:rPr>
+                <w:rFonts w:eastAsiaTheme="minorEastAsia"/>
+                <w:noProof/>
+              </w:rPr>
+              <w:tab/>
+            </w:r>
+            <w:r>
+              <w:rPr>
+                <w:rStyle w:val="Hyperlink"/>
+                <w:noProof/>
+              </w:rPr>
+              <w:t>Overview of User Interface Design</w:t>
+            </w:r>
+            <w:r>
+              <w:rPr>
+                <w:noProof/>
+                <w:webHidden/>
+              </w:rPr>
+              <w:tab/>
+            </w:r>
+            <w:r>
+              <w:rPr>
+                <w:noProof/>
+                <w:webHidden/>
+              </w:rPr>
+              <w:fldChar w:fldCharType="begin"/>
+            </w:r>
+            <w:r>
+              <w:rPr>
+                <w:noProof/>
+                <w:webHidden/>
+              </w:rPr>
+              <w:instrText xml:space="preserve"> PAGEREF _Toc241079970 \h </w:instrText>
+            </w:r>
+            <w:r>
+              <w:rPr>
+                <w:noProof/>
+                <w:webHidden/>
+              </w:rPr>
+            </w:r>
+            <w:r>
+              <w:rPr>
+                <w:noProof/>
+                <w:webHidden/>
+              </w:rPr>
+              <w:fldChar w:fldCharType="separate"/>
+            </w:r>
+            <w:r>
+              <w:rPr>
+                <w:noProof/>
+                <w:webHidden/>
+              </w:rPr>
+              <w:t>7</w:t>
+            </w:r>
+            <w:r>
+              <w:rPr>
+                <w:noProof/>
+                <w:webHidden/>
+              </w:rPr>
+              <w:fldChar w:fldCharType="end"/>
+            </w:r>
+          </w:hyperlink>
+        </w:p>
+        <w:p>
+          <w:pPr>
+            <w:pStyle w:val="TOC2"/>
+            <w:tabs>
+              <w:tab w:val="left" w:pos="960"/>
+              <w:tab w:val="right" w:leader="dot" w:pos="9350"/>
+            </w:tabs>
+            <w:rPr>
+              <w:rFonts w:eastAsiaTheme="minorEastAsia"/>
+              <w:noProof/>
+            </w:rPr>
+          </w:pPr>
+          <w:hyperlink w:anchor="_Toc241079971" w:history="1">
+            <w:r>
+              <w:rPr>
+                <w:rStyle w:val="Hyperlink"/>
+                <w:noProof/>
+              </w:rPr>
+              <w:t>5.2.</w:t>
+            </w:r>
+            <w:r>
+              <w:rPr>
+                <w:rFonts w:eastAsiaTheme="minorEastAsia"/>
+                <w:noProof/>
+              </w:rPr>
+              <w:tab/>
+            </w:r>
+            <w:r>
+              <w:rPr>
+                <w:rStyle w:val="Hyperlink"/>
+                <w:noProof/>
+              </w:rPr>
+              <w:t>User Interface Screen Images</w:t>
+            </w:r>
+            <w:r>
+              <w:rPr>
+                <w:noProof/>
+                <w:webHidden/>
+              </w:rPr>
+              <w:tab/>
+            </w:r>
+            <w:r>
+              <w:rPr>
+                <w:noProof/>
+                <w:webHidden/>
+              </w:rPr>
+              <w:fldChar w:fldCharType="begin"/>
+            </w:r>
+            <w:r>
+              <w:rPr>
+                <w:noProof/>
+                <w:webHidden/>
+              </w:rPr>
+              <w:instrText xml:space="preserve"> PAGEREF _Toc241079971 \h </w:instrText>
+            </w:r>
+            <w:r>
+              <w:rPr>
+                <w:noProof/>
+                <w:webHidden/>
+              </w:rPr>
+            </w:r>
+            <w:r>
+              <w:rPr>
+                <w:noProof/>
+                <w:webHidden/>
+              </w:rPr>
+              <w:fldChar w:fldCharType="separate"/>
+            </w:r>
+            <w:r>
+              <w:rPr>
+                <w:noProof/>
+                <w:webHidden/>
+              </w:rPr>
+              <w:t>8</w:t>
+            </w:r>
+            <w:r>
+              <w:rPr>
+                <w:noProof/>
+                <w:webHidden/>
+              </w:rPr>
+              <w:fldChar w:fldCharType="end"/>
+            </w:r>
+          </w:hyperlink>
+        </w:p>
+        <w:p>
+          <w:pPr>
+            <w:pStyle w:val="TOC2"/>
+            <w:tabs>
+              <w:tab w:val="left" w:pos="960"/>
+              <w:tab w:val="right" w:leader="dot" w:pos="9350"/>
+            </w:tabs>
+            <w:rPr>
+              <w:rFonts w:eastAsiaTheme="minorEastAsia"/>
+              <w:noProof/>
+            </w:rPr>
+          </w:pPr>
+          <w:hyperlink w:anchor="_Toc241079972" w:history="1">
+            <w:r>
+              <w:rPr>
+                <w:rStyle w:val="Hyperlink"/>
+                <w:noProof/>
+              </w:rPr>
+              <w:t>5.3.</w:t>
+            </w:r>
+            <w:r>
+              <w:rPr>
+                <w:rFonts w:eastAsiaTheme="minorEastAsia"/>
+                <w:noProof/>
+              </w:rPr>
+              <w:tab/>
+            </w:r>
+            <w:r>
+              <w:rPr>
+                <w:rStyle w:val="Hyperlink"/>
+                <w:noProof/>
+              </w:rPr>
+              <w:t>User Interface Objects and Actions</w:t>
+            </w:r>
+            <w:r>
+              <w:rPr>
+                <w:noProof/>
+                <w:webHidden/>
+              </w:rPr>
+              <w:tab/>
+            </w:r>
+            <w:r>
+              <w:rPr>
+                <w:noProof/>
+                <w:webHidden/>
+              </w:rPr>
+              <w:fldChar w:fldCharType="begin"/>
+            </w:r>
+            <w:r>
+              <w:rPr>
+                <w:noProof/>
+                <w:webHidden/>
+              </w:rPr>
+              <w:instrText xml:space="preserve"> PAGEREF _Toc241079972 \h </w:instrText>
+            </w:r>
+            <w:r>
+              <w:rPr>
+                <w:noProof/>
+                <w:webHidden/>
+              </w:rPr>
+            </w:r>
+            <w:r>
+              <w:rPr>
+                <w:noProof/>
+                <w:webHidden/>
+              </w:rPr>
+              <w:fldChar w:fldCharType="separate"/>
+            </w:r>
+            <w:r>
+              <w:rPr>
+                <w:noProof/>
+                <w:webHidden/>
+              </w:rPr>
+              <w:t>10</w:t>
+            </w:r>
+            <w:r>
+              <w:rPr>
+                <w:noProof/>
+                <w:webHidden/>
+              </w:rPr>
+              <w:fldChar w:fldCharType="end"/>
+            </w:r>
+          </w:hyperlink>
+        </w:p>
+        <w:p>
+          <w:pPr>
+            <w:pStyle w:val="TOC1"/>
+            <w:tabs>
+              <w:tab w:val="left" w:pos="480"/>
+              <w:tab w:val="right" w:leader="dot" w:pos="9350"/>
+            </w:tabs>
+            <w:rPr>
+              <w:rFonts w:eastAsiaTheme="minorEastAsia"/>
+              <w:noProof/>
+            </w:rPr>
+          </w:pPr>
+          <w:hyperlink w:anchor="_Toc241079973" w:history="1">
+            <w:r>
+              <w:rPr>
+                <w:rStyle w:val="Hyperlink"/>
+                <w:noProof/>
+              </w:rPr>
+              <w:t>6.</w:t>
+            </w:r>
+            <w:r>
+              <w:rPr>
+                <w:rFonts w:eastAsiaTheme="minorEastAsia"/>
+                <w:noProof/>
+              </w:rPr>
+              <w:tab/>
+            </w:r>
+            <w:r>
+              <w:rPr>
+                <w:rStyle w:val="Hyperlink"/>
+                <w:noProof/>
+              </w:rPr>
+              <w:t>Appendix</w:t>
+            </w:r>
+            <w:r>
+              <w:rPr>
+                <w:noProof/>
+                <w:webHidden/>
+              </w:rPr>
+              <w:tab/>
+            </w:r>
+            <w:r>
+              <w:rPr>
+                <w:noProof/>
+                <w:webHidden/>
+              </w:rPr>
+              <w:fldChar w:fldCharType="begin"/>
+            </w:r>
+            <w:r>
+              <w:rPr>
+                <w:noProof/>
+                <w:webHidden/>
+              </w:rPr>
+              <w:instrText xml:space="preserve"> PAGEREF _Toc241079973 \h </w:instrText>
+            </w:r>
+            <w:r>
+              <w:rPr>
+                <w:noProof/>
+                <w:webHidden/>
+              </w:rPr>
+            </w:r>
+            <w:r>
+              <w:rPr>
+                <w:noProof/>
+                <w:webHidden/>
+              </w:rPr>
+              <w:fldChar w:fldCharType="separate"/>
+            </w:r>
+            <w:r>
+              <w:rPr>
+                <w:noProof/>
+                <w:webHidden/>
+              </w:rPr>
+              <w:t>10</w:t>
+            </w:r>
+            <w:r>
+              <w:rPr>
+                <w:noProof/>
+                <w:webHidden/>
+              </w:rPr>
+              <w:fldChar w:fldCharType="end"/>
+            </w:r>
+          </w:hyperlink>
+        </w:p>
+        <w:p>
+          <w:pPr>
+            <w:pStyle w:val="TOC2"/>
+            <w:tabs>
+              <w:tab w:val="left" w:pos="960"/>
+              <w:tab w:val="right" w:leader="dot" w:pos="9350"/>
+            </w:tabs>
+            <w:rPr>
+              <w:rFonts w:eastAsiaTheme="minorEastAsia"/>
+              <w:noProof/>
+            </w:rPr>
+          </w:pPr>
+          <w:hyperlink w:anchor="_Toc241079974" w:history="1">
+            <w:r>
+              <w:rPr>
+                <w:rStyle w:val="Hyperlink"/>
+                <w:noProof/>
+              </w:rPr>
+              <w:t>6.1.</w:t>
+            </w:r>
+            <w:r>
+              <w:rPr>
+                <w:rFonts w:eastAsiaTheme="minorEastAsia"/>
+                <w:noProof/>
+              </w:rPr>
+              <w:tab/>
+            </w:r>
+            <w:r>
+              <w:rPr>
+                <w:rStyle w:val="Hyperlink"/>
+                <w:noProof/>
+              </w:rPr>
+              <w:t>Planned Additions to Existing Software</w:t>
+            </w:r>
+            <w:r>
+              <w:rPr>
+                <w:noProof/>
+                <w:webHidden/>
+              </w:rPr>
+              <w:tab/>
+            </w:r>
+            <w:r>
+              <w:rPr>
+                <w:noProof/>
+                <w:webHidden/>
+              </w:rPr>
+              <w:fldChar w:fldCharType="begin"/>
+            </w:r>
+            <w:r>
+              <w:rPr>
+                <w:noProof/>
+                <w:webHidden/>
+              </w:rPr>
+              <w:instrText xml:space="preserve"> PAGEREF _Toc241079974 \h </w:instrText>
+            </w:r>
+            <w:r>
+              <w:rPr>
+                <w:noProof/>
+                <w:webHidden/>
+              </w:rPr>
+            </w:r>
+            <w:r>
+              <w:rPr>
+                <w:noProof/>
+                <w:webHidden/>
+              </w:rPr>
+              <w:fldChar w:fldCharType="separate"/>
+            </w:r>
+            <w:r>
+              <w:rPr>
+                <w:noProof/>
+                <w:webHidden/>
+              </w:rPr>
+              <w:t>10</w:t>
+            </w:r>
+            <w:r>
+              <w:rPr>
+                <w:noProof/>
+                <w:webHidden/>
+              </w:rPr>
+              <w:fldChar w:fldCharType="end"/>
+            </w:r>
+          </w:hyperlink>
+        </w:p>
+        <w:p>
+          <w:pPr>
+            <w:pStyle w:val="TOC2"/>
+            <w:tabs>
+              <w:tab w:val="left" w:pos="960"/>
+              <w:tab w:val="right" w:leader="dot" w:pos="9350"/>
+            </w:tabs>
+            <w:rPr>
+              <w:rFonts w:eastAsiaTheme="minorEastAsia"/>
+              <w:noProof/>
+            </w:rPr>
+          </w:pPr>
+          <w:hyperlink w:anchor="_Toc241079975" w:history="1">
+            <w:r>
+              <w:rPr>
+                <w:rStyle w:val="Hyperlink"/>
+                <w:noProof/>
+              </w:rPr>
+              <w:t>6.2.</w:t>
+            </w:r>
+            <w:r>
+              <w:rPr>
+                <w:rFonts w:eastAsiaTheme="minorEastAsia"/>
+                <w:noProof/>
+              </w:rPr>
+              <w:tab/>
+            </w:r>
+            <w:r>
+              <w:rPr>
+                <w:rStyle w:val="Hyperlink"/>
+                <w:noProof/>
+              </w:rPr>
+              <w:t>Current State of Agent</w:t>
+            </w:r>
+            <w:r>
+              <w:rPr>
+                <w:noProof/>
+                <w:webHidden/>
+              </w:rPr>
+              <w:tab/>
+            </w:r>
+            <w:r>
+              <w:rPr>
+                <w:noProof/>
+                <w:webHidden/>
+              </w:rPr>
+              <w:fldChar w:fldCharType="begin"/>
+            </w:r>
+            <w:r>
+              <w:rPr>
+                <w:noProof/>
+                <w:webHidden/>
+              </w:rPr>
+              <w:instrText xml:space="preserve"> PAGEREF _Toc241079975 \h </w:instrText>
+            </w:r>
+            <w:r>
+              <w:rPr>
+                <w:noProof/>
+                <w:webHidden/>
+              </w:rPr>
+            </w:r>
+            <w:r>
+              <w:rPr>
+                <w:noProof/>
+                <w:webHidden/>
+              </w:rPr>
+              <w:fldChar w:fldCharType="separate"/>
+            </w:r>
+            <w:r>
+              <w:rPr>
+                <w:noProof/>
+                <w:webHidden/>
+              </w:rPr>
+              <w:t>10</w:t>
+            </w:r>
+            <w:r>
+              <w:rPr>
+                <w:noProof/>
+                <w:webHidden/>
+              </w:rPr>
+              <w:fldChar w:fldCharType="end"/>
+            </w:r>
+          </w:hyperlink>
+        </w:p>
+        <w:p>
+          <w:r>
+            <w:rPr>
+              <w:b/>
+              <w:bCs/>
+              <w:noProof/>
+            </w:rPr>
+            <w:fldChar w:fldCharType="end"/>
+          </w:r>
+        </w:p>
+      </w:sdtContent>
+    </w:sdt>
+    <w:p>
+      <w:pPr>
+        <w:spacing w:line="240" w:lineRule="auto"/>
+        <w:rPr>
+          <w:b/>
+          <w:bCs/>
+        </w:rPr>
+      </w:pPr>
+    </w:p>
+    <w:p>
+      <w:pPr>
+        <w:spacing w:line="240" w:lineRule="auto"/>
+        <w:rPr>
+          <w:b/>
+          <w:bCs/>
+        </w:rPr>
+      </w:pPr>
+    </w:p>
+    <w:p>
+      <w:pPr>
+        <w:spacing w:line="240" w:lineRule="auto"/>
+        <w:rPr>
+          <w:b/>
+          <w:bCs/>
+        </w:rPr>
+      </w:pPr>
+    </w:p>
+    <w:p>
+      <w:pPr>
+        <w:spacing w:line="240" w:lineRule="auto"/>
+        <w:rPr>
+          <w:b/>
+          <w:bCs/>
+        </w:rPr>
+      </w:pPr>
+    </w:p>
+    <w:p>
+      <w:pPr>
+        <w:spacing w:line="240" w:lineRule="auto"/>
+        <w:rPr>
+          <w:b/>
+          <w:bCs/>
+        </w:rPr>
+      </w:pPr>
+    </w:p>
+    <w:p>
+      <w:pPr>
+        <w:spacing w:line="240" w:lineRule="auto"/>
+        <w:rPr>
+          <w:b/>
+          <w:bCs/>
+        </w:rPr>
+      </w:pPr>
+    </w:p>
+    <w:p>
+      <w:pPr>
+        <w:spacing w:line="240" w:lineRule="auto"/>
+        <w:rPr>
+          <w:b/>
+          <w:bCs/>
+        </w:rPr>
+      </w:pPr>
+    </w:p>
+    <w:p>
+      <w:pPr>
+        <w:pStyle w:val="Heading1"/>
+        <w:numPr>
+          <w:ilvl w:val="0"/>
+          <w:numId w:val="21"/>
+        </w:numPr>
+      </w:pPr>
+      <w:bookmarkStart w:id="0" w:name="_Toc241079956"/>
+      <w:r>
+        <w:lastRenderedPageBreak/>
+        <w:t>Introduction</w:t>
+      </w:r>
+      <w:bookmarkEnd w:id="0"/>
+    </w:p>
+    <w:p>
+      <w:pPr>
+        <w:pStyle w:val="Heading2"/>
+        <w:numPr>
+          <w:ilvl w:val="1"/>
+          <w:numId w:val="21"/>
+        </w:numPr>
         <w:rPr>
           <w:sz w:val="48"/>
           <w:szCs w:val="48"/>
         </w:rPr>
       </w:pPr>
-      <w:r>
-        <w:rPr>
-          <w:b/>
-          <w:bCs/>
-          <w:sz w:val="48"/>
-          <w:szCs w:val="48"/>
-        </w:rPr>
-        <w:lastRenderedPageBreak/>
-        <w:t>Table of Contents</w:t>
-      </w:r>
+      <w:bookmarkStart w:id="1" w:name="_Toc241079957"/>
+      <w:r>
+        <w:t>Purpose</w:t>
+      </w:r>
+      <w:bookmarkEnd w:id="1"/>
     </w:p>
     <w:p>
       <w:pPr>
         <w:pStyle w:val="ListParagraph"/>
+        <w:spacing w:line="240" w:lineRule="auto"/>
+        <w:ind w:left="1080"/>
+      </w:pPr>
+      <w:r>
+        <w:t>This is</w:t>
+      </w:r>
+      <w:r>
+        <w:t xml:space="preserve"> the design document for the Autonomous Cognitive Agent Flying Aircraft in X-Plane project. It outlines the overall architecture and design of the project, defining how the different software systems in the project interact with each other.</w:t>
+      </w:r>
+      <w:r>
+        <w:t xml:space="preserve"> Additionally, this document shows </w:t>
+      </w:r>
+      <w:r>
+        <w:t>a visual of the current UI implementation, as well as how we intend to expand the UI to work with the improvements to the current system we are attempting to make.</w:t>
+      </w:r>
+    </w:p>
+    <w:p>
+      <w:pPr>
+        <w:pStyle w:val="Heading2"/>
+        <w:numPr>
+          <w:ilvl w:val="1"/>
+          <w:numId w:val="21"/>
+        </w:numPr>
+      </w:pPr>
+      <w:bookmarkStart w:id="2" w:name="_Toc241079958"/>
+      <w:r>
+        <w:t>Scope</w:t>
+      </w:r>
+      <w:bookmarkEnd w:id="2"/>
+    </w:p>
+    <w:p>
+      <w:pPr>
+        <w:spacing w:line="240" w:lineRule="auto"/>
+        <w:ind w:left="1080"/>
+      </w:pPr>
+      <w:r>
+        <w:t xml:space="preserve">This software is intended to be a </w:t>
+      </w:r>
+      <w:r>
+        <w:t>SOAR Architecture agent</w:t>
+      </w:r>
+      <w:r>
+        <w:t xml:space="preserve"> that interacts with the X-Plane 12 flight simulator via the NASA Plugin XPC.</w:t>
+      </w:r>
+      <w:r>
+        <w:t xml:space="preserve"> The agent </w:t>
+      </w:r>
+      <w:r>
+        <w:t>will be flying the Beta Technologies Alia-250 VTOL aircraft in X-Plane</w:t>
+      </w:r>
+      <w:r>
+        <w:t>. The goal is to improve upon the existing agent that handles takeoff, landing, and flight to handle and react to various equipment failures that an aircraft could encounter mid-flight. This could mean diverting, or landing in a field even.</w:t>
+      </w:r>
+      <w:r>
+        <w:t xml:space="preserve"> The current agent handles single engine failure, </w:t>
+      </w:r>
+      <w:r>
+        <w:t xml:space="preserve">and </w:t>
+      </w:r>
+      <w:r>
+        <w:t xml:space="preserve">we plan on implementing </w:t>
+      </w:r>
+      <w:r>
+        <w:t>a system to handle various sensor failures such as GPS or IMU failures.</w:t>
+      </w:r>
+      <w:r>
+        <w:t xml:space="preserve"> The agent currently does not support</w:t>
+      </w:r>
+      <w:r>
+        <w:t xml:space="preserve"> dynamically modifying its route mid-flight, so we plan on implementing this later as well to assist with </w:t>
+      </w:r>
+      <w:r>
+        <w:t>engine failure management.</w:t>
+      </w:r>
+    </w:p>
+    <w:p>
+      <w:pPr>
+        <w:pStyle w:val="Heading2"/>
+        <w:numPr>
+          <w:ilvl w:val="1"/>
+          <w:numId w:val="21"/>
+        </w:numPr>
+      </w:pPr>
+      <w:bookmarkStart w:id="3" w:name="_Toc241079959"/>
+      <w:r>
+        <w:t>Intended Audience</w:t>
+      </w:r>
+      <w:bookmarkEnd w:id="3"/>
+    </w:p>
+    <w:p>
+      <w:pPr>
+        <w:spacing w:line="240" w:lineRule="auto"/>
+        <w:ind w:left="1080"/>
+      </w:pPr>
+      <w:r>
+        <w:t>The intended audience for this project is Dr. Siddhartha Bhattacharya</w:t>
+      </w:r>
+      <w:r>
+        <w:t>, the aviation community, and software developers. This project will be a part of the 2026</w:t>
+      </w:r>
+      <w:r>
+        <w:t xml:space="preserve"> Northrop Grumman</w:t>
+      </w:r>
+      <w:r>
+        <w:t xml:space="preserve"> Engineering and Design Showcase at the Florida Institute of Technology.</w:t>
+      </w:r>
+    </w:p>
+    <w:p>
+      <w:pPr>
+        <w:spacing w:line="240" w:lineRule="auto"/>
+        <w:ind w:left="1080"/>
+      </w:pPr>
+    </w:p>
+    <w:p>
+      <w:pPr>
+        <w:spacing w:line="240" w:lineRule="auto"/>
+        <w:ind w:left="1080"/>
+      </w:pPr>
+    </w:p>
+    <w:p>
+      <w:pPr>
+        <w:spacing w:line="240" w:lineRule="auto"/>
+        <w:ind w:left="1080"/>
+      </w:pPr>
+    </w:p>
+    <w:p>
+      <w:pPr>
+        <w:spacing w:line="240" w:lineRule="auto"/>
+        <w:ind w:left="1080"/>
+      </w:pPr>
+    </w:p>
+    <w:p>
+      <w:pPr>
+        <w:spacing w:line="240" w:lineRule="auto"/>
+        <w:ind w:left="1080"/>
+      </w:pPr>
+    </w:p>
+    <w:p>
+      <w:pPr>
+        <w:spacing w:line="240" w:lineRule="auto"/>
+        <w:ind w:left="1080"/>
+      </w:pPr>
+    </w:p>
+    <w:p>
+      <w:pPr>
+        <w:spacing w:line="240" w:lineRule="auto"/>
+        <w:ind w:left="1080"/>
+      </w:pPr>
+    </w:p>
+    <w:p>
+      <w:pPr>
+        <w:spacing w:line="240" w:lineRule="auto"/>
+        <w:ind w:left="1080"/>
+      </w:pPr>
+    </w:p>
+    <w:p>
+      <w:pPr>
+        <w:spacing w:line="240" w:lineRule="auto"/>
+      </w:pPr>
+    </w:p>
+    <w:p>
+      <w:pPr>
+        <w:pStyle w:val="Heading1"/>
         <w:numPr>
           <w:ilvl w:val="0"/>
-          <w:numId w:val="1"/>
+          <w:numId w:val="21"/>
         </w:numPr>
-        <w:spacing w:line="240" w:lineRule="auto"/>
-        <w:rPr>
-          <w:b/>
-          <w:bCs/>
-        </w:rPr>
-      </w:pPr>
-      <w:r>
-        <w:rPr>
-          <w:b/>
-          <w:bCs/>
-        </w:rPr>
-        <w:t>Introduction</w:t>
-      </w:r>
-    </w:p>
-    <w:p>
-      <w:pPr>
-        <w:pStyle w:val="ListParagraph"/>
-        <w:numPr>
-          <w:ilvl w:val="1"/>
-          <w:numId w:val="1"/>
-        </w:numPr>
-        <w:spacing w:line="240" w:lineRule="auto"/>
-        <w:rPr>
-          <w:b/>
-          <w:bCs/>
-        </w:rPr>
-      </w:pPr>
-      <w:r>
-        <w:t>Purpose</w:t>
-      </w:r>
-    </w:p>
-    <w:p>
-      <w:pPr>
-        <w:pStyle w:val="ListParagraph"/>
-        <w:numPr>
-          <w:ilvl w:val="1"/>
-          <w:numId w:val="1"/>
-        </w:numPr>
-        <w:spacing w:line="240" w:lineRule="auto"/>
-        <w:rPr>
-          <w:b/>
-          <w:bCs/>
-        </w:rPr>
-      </w:pPr>
-      <w:r>
-        <w:t>Scope</w:t>
-      </w:r>
-    </w:p>
-    <w:p>
-      <w:pPr>
-        <w:pStyle w:val="ListParagraph"/>
-        <w:numPr>
-          <w:ilvl w:val="1"/>
-          <w:numId w:val="1"/>
-        </w:numPr>
-        <w:spacing w:line="240" w:lineRule="auto"/>
-        <w:rPr>
-          <w:b/>
-          <w:bCs/>
-        </w:rPr>
-      </w:pPr>
-      <w:r>
-        <w:t>Intended Audienc</w:t>
-      </w:r>
-      <w:r>
-        <w:t>e</w:t>
-      </w:r>
-    </w:p>
-    <w:p>
-      <w:pPr>
-        <w:pStyle w:val="ListParagraph"/>
-        <w:numPr>
-          <w:ilvl w:val="0"/>
-          <w:numId w:val="1"/>
-        </w:numPr>
-        <w:spacing w:line="240" w:lineRule="auto"/>
-        <w:rPr>
-          <w:b/>
-          <w:bCs/>
-        </w:rPr>
-      </w:pPr>
-      <w:r>
-        <w:rPr>
-          <w:b/>
-          <w:bCs/>
-        </w:rPr>
-        <w:t>Definitions and Acronyms</w:t>
-      </w:r>
-    </w:p>
-    <w:p>
-      <w:pPr>
-        <w:pStyle w:val="ListParagraph"/>
-        <w:numPr>
-          <w:ilvl w:val="0"/>
-          <w:numId w:val="1"/>
-        </w:numPr>
-        <w:spacing w:line="240" w:lineRule="auto"/>
-        <w:rPr>
-          <w:b/>
-          <w:bCs/>
-        </w:rPr>
-      </w:pPr>
-      <w:r>
-        <w:rPr>
-          <w:b/>
-          <w:bCs/>
-        </w:rPr>
-        <w:t xml:space="preserve">System </w:t>
-      </w:r>
-      <w:r>
-        <w:rPr>
-          <w:b/>
-          <w:bCs/>
-        </w:rPr>
-        <w:t>Design</w:t>
-      </w:r>
-    </w:p>
-    <w:p>
-      <w:pPr>
-        <w:pStyle w:val="ListParagraph"/>
-        <w:numPr>
-          <w:ilvl w:val="1"/>
-          <w:numId w:val="1"/>
-        </w:numPr>
-        <w:spacing w:line="240" w:lineRule="auto"/>
-        <w:rPr>
-          <w:b/>
-          <w:bCs/>
-        </w:rPr>
-      </w:pPr>
-      <w:r>
-        <w:t>Design Overview</w:t>
-      </w:r>
-    </w:p>
-    <w:p>
-      <w:pPr>
-        <w:pStyle w:val="ListParagraph"/>
-        <w:numPr>
-          <w:ilvl w:val="1"/>
-          <w:numId w:val="1"/>
-        </w:numPr>
-        <w:spacing w:line="240" w:lineRule="auto"/>
-        <w:rPr>
-          <w:b/>
-          <w:bCs/>
-        </w:rPr>
-      </w:pPr>
-      <w:r>
-        <w:t>System Architecture</w:t>
-      </w:r>
-    </w:p>
-    <w:p>
-      <w:pPr>
-        <w:pStyle w:val="ListParagraph"/>
-        <w:numPr>
-          <w:ilvl w:val="0"/>
-          <w:numId w:val="1"/>
-        </w:numPr>
-        <w:spacing w:line="240" w:lineRule="auto"/>
-        <w:rPr>
-          <w:b/>
-          <w:bCs/>
-        </w:rPr>
-      </w:pPr>
-      <w:r>
-        <w:rPr>
-          <w:b/>
-          <w:bCs/>
-        </w:rPr>
-        <w:t>Component Design</w:t>
-      </w:r>
-    </w:p>
-    <w:p>
-      <w:pPr>
-        <w:pStyle w:val="ListParagraph"/>
-        <w:numPr>
-          <w:ilvl w:val="1"/>
-          <w:numId w:val="1"/>
-        </w:numPr>
-        <w:spacing w:line="240" w:lineRule="auto"/>
-        <w:rPr>
-          <w:b/>
-          <w:bCs/>
-        </w:rPr>
-      </w:pPr>
-      <w:r>
-        <w:t>CCAT</w:t>
-      </w:r>
-    </w:p>
-    <w:p>
-      <w:pPr>
-        <w:pStyle w:val="ListParagraph"/>
-        <w:numPr>
-          <w:ilvl w:val="1"/>
-          <w:numId w:val="1"/>
-        </w:numPr>
-        <w:spacing w:line="240" w:lineRule="auto"/>
-        <w:rPr>
-          <w:b/>
-          <w:bCs/>
-        </w:rPr>
-      </w:pPr>
-      <w:r>
-        <w:t>SOAR Agent</w:t>
-      </w:r>
-    </w:p>
-    <w:p>
-      <w:pPr>
-        <w:pStyle w:val="ListParagraph"/>
-        <w:numPr>
-          <w:ilvl w:val="1"/>
-          <w:numId w:val="1"/>
-        </w:numPr>
-        <w:spacing w:line="240" w:lineRule="auto"/>
-        <w:rPr>
-          <w:b/>
-          <w:bCs/>
-        </w:rPr>
-      </w:pPr>
-      <w:r>
-        <w:t>GUI</w:t>
-      </w:r>
-    </w:p>
-    <w:p>
-      <w:pPr>
-        <w:pStyle w:val="ListParagraph"/>
-        <w:numPr>
-          <w:ilvl w:val="1"/>
-          <w:numId w:val="1"/>
-        </w:numPr>
-        <w:spacing w:line="240" w:lineRule="auto"/>
-        <w:rPr>
-          <w:b/>
-          <w:bCs/>
-        </w:rPr>
-      </w:pPr>
-      <w:proofErr w:type="spellStart"/>
-      <w:r>
-        <w:t>Datarefs</w:t>
-      </w:r>
-      <w:proofErr w:type="spellEnd"/>
-    </w:p>
-    <w:p>
-      <w:pPr>
-        <w:pStyle w:val="ListParagraph"/>
-        <w:numPr>
-          <w:ilvl w:val="0"/>
-          <w:numId w:val="1"/>
-        </w:numPr>
-        <w:spacing w:line="240" w:lineRule="auto"/>
-        <w:rPr>
-          <w:b/>
-          <w:bCs/>
-        </w:rPr>
-      </w:pPr>
-      <w:r>
-        <w:rPr>
-          <w:b/>
-          <w:bCs/>
-        </w:rPr>
-        <w:t>User</w:t>
-      </w:r>
-      <w:r>
-        <w:rPr>
-          <w:b/>
-          <w:bCs/>
-        </w:rPr>
-        <w:t xml:space="preserve"> Interface Design</w:t>
-      </w:r>
-    </w:p>
-    <w:p>
-      <w:pPr>
-        <w:pStyle w:val="ListParagraph"/>
-        <w:numPr>
-          <w:ilvl w:val="1"/>
-          <w:numId w:val="1"/>
-        </w:numPr>
-        <w:spacing w:line="240" w:lineRule="auto"/>
-        <w:rPr>
-          <w:b/>
-          <w:bCs/>
-        </w:rPr>
-      </w:pPr>
-      <w:r>
-        <w:t>Overview of User Interface</w:t>
-      </w:r>
-    </w:p>
-    <w:p>
-      <w:pPr>
-        <w:pStyle w:val="ListParagraph"/>
-        <w:numPr>
-          <w:ilvl w:val="1"/>
-          <w:numId w:val="1"/>
-        </w:numPr>
-        <w:spacing w:line="240" w:lineRule="auto"/>
-        <w:rPr>
-          <w:b/>
-          <w:bCs/>
-        </w:rPr>
-      </w:pPr>
-      <w:r>
-        <w:t>User Interface</w:t>
-      </w:r>
-      <w:r>
-        <w:t xml:space="preserve"> Screen Images</w:t>
-      </w:r>
-    </w:p>
-    <w:p>
-      <w:pPr>
-        <w:pStyle w:val="ListParagraph"/>
-        <w:numPr>
-          <w:ilvl w:val="0"/>
-          <w:numId w:val="1"/>
-        </w:numPr>
-        <w:spacing w:line="240" w:lineRule="auto"/>
-        <w:rPr>
-          <w:b/>
-          <w:bCs/>
-        </w:rPr>
-      </w:pPr>
-      <w:r>
-        <w:rPr>
-          <w:b/>
-          <w:bCs/>
-        </w:rPr>
-        <w:t>Appendix</w:t>
-      </w:r>
-    </w:p>
-    <w:p>
-      <w:pPr>
-        <w:spacing w:line="240" w:lineRule="auto"/>
-        <w:rPr>
-          <w:b/>
-          <w:bCs/>
-        </w:rPr>
-      </w:pPr>
-    </w:p>
-    <w:p>
-      <w:pPr>
-        <w:spacing w:line="240" w:lineRule="auto"/>
-        <w:rPr>
-          <w:b/>
-          <w:bCs/>
-        </w:rPr>
-      </w:pPr>
-    </w:p>
-    <w:p>
-      <w:pPr>
-        <w:spacing w:line="240" w:lineRule="auto"/>
-        <w:rPr>
-          <w:b/>
-          <w:bCs/>
-        </w:rPr>
-      </w:pPr>
-    </w:p>
-    <w:p>
-      <w:pPr>
-        <w:spacing w:line="240" w:lineRule="auto"/>
-        <w:rPr>
-          <w:b/>
-          <w:bCs/>
-        </w:rPr>
-      </w:pPr>
-    </w:p>
-    <w:p>
-      <w:pPr>
-        <w:spacing w:line="240" w:lineRule="auto"/>
-        <w:rPr>
-          <w:b/>
-          <w:bCs/>
-        </w:rPr>
-      </w:pPr>
-    </w:p>
-    <w:p>
-      <w:pPr>
-        <w:spacing w:line="240" w:lineRule="auto"/>
-        <w:rPr>
-          <w:b/>
-          <w:bCs/>
-        </w:rPr>
-      </w:pPr>
-    </w:p>
-    <w:p>
-      <w:pPr>
-        <w:spacing w:line="240" w:lineRule="auto"/>
-        <w:rPr>
-          <w:b/>
-          <w:bCs/>
-        </w:rPr>
-      </w:pPr>
-    </w:p>
-    <w:p>
-      <w:pPr>
-        <w:spacing w:line="240" w:lineRule="auto"/>
-        <w:rPr>
-          <w:b/>
-          <w:bCs/>
-        </w:rPr>
-      </w:pPr>
-    </w:p>
-    <w:p>
-      <w:pPr>
-        <w:spacing w:line="240" w:lineRule="auto"/>
-        <w:rPr>
-          <w:b/>
-          <w:bCs/>
-        </w:rPr>
-      </w:pPr>
-    </w:p>
-    <w:p>
-      <w:pPr>
-        <w:spacing w:line="240" w:lineRule="auto"/>
-        <w:rPr>
-          <w:b/>
-          <w:bCs/>
-        </w:rPr>
-      </w:pPr>
-    </w:p>
-    <w:p>
-      <w:pPr>
-        <w:spacing w:line="240" w:lineRule="auto"/>
-        <w:rPr>
-          <w:b/>
-          <w:bCs/>
-        </w:rPr>
-      </w:pPr>
-    </w:p>
-    <w:p>
-      <w:pPr>
-        <w:spacing w:line="240" w:lineRule="auto"/>
-        <w:rPr>
-          <w:b/>
-          <w:bCs/>
-        </w:rPr>
-      </w:pPr>
-    </w:p>
-    <w:p>
-      <w:pPr>
-        <w:spacing w:line="240" w:lineRule="auto"/>
-        <w:rPr>
-          <w:b/>
-          <w:bCs/>
-        </w:rPr>
-      </w:pPr>
-    </w:p>
-    <w:p>
-      <w:pPr>
-        <w:spacing w:line="240" w:lineRule="auto"/>
-        <w:rPr>
-          <w:b/>
-          <w:bCs/>
-        </w:rPr>
-      </w:pPr>
-    </w:p>
-    <w:p>
-      <w:pPr>
-        <w:spacing w:line="240" w:lineRule="auto"/>
-        <w:rPr>
-          <w:b/>
-          <w:bCs/>
-        </w:rPr>
-      </w:pPr>
-    </w:p>
-    <w:p>
-      <w:pPr>
-        <w:pStyle w:val="ListParagraph"/>
-        <w:numPr>
-          <w:ilvl w:val="0"/>
-          <w:numId w:val="6"/>
-        </w:numPr>
-        <w:spacing w:line="240" w:lineRule="auto"/>
-        <w:rPr>
-          <w:b/>
-          <w:bCs/>
-          <w:sz w:val="48"/>
-          <w:szCs w:val="48"/>
-        </w:rPr>
-      </w:pPr>
-      <w:r>
-        <w:rPr>
-          <w:b/>
-          <w:bCs/>
-          <w:sz w:val="48"/>
-          <w:szCs w:val="48"/>
-        </w:rPr>
-        <w:lastRenderedPageBreak/>
-        <w:t>Introduction</w:t>
-      </w:r>
-    </w:p>
-    <w:p>
-      <w:pPr>
-        <w:pStyle w:val="ListParagraph"/>
-        <w:numPr>
-          <w:ilvl w:val="1"/>
-          <w:numId w:val="10"/>
-        </w:numPr>
-        <w:spacing w:line="240" w:lineRule="auto"/>
-        <w:rPr>
-          <w:b/>
-          <w:bCs/>
-          <w:sz w:val="48"/>
-          <w:szCs w:val="48"/>
-        </w:rPr>
-      </w:pPr>
-      <w:r>
-        <w:rPr>
-          <w:b/>
-          <w:bCs/>
-          <w:sz w:val="36"/>
-          <w:szCs w:val="36"/>
-        </w:rPr>
-        <w:t>Purpose</w:t>
-      </w:r>
-    </w:p>
-    <w:p>
-      <w:pPr>
-        <w:pStyle w:val="ListParagraph"/>
-        <w:spacing w:line="240" w:lineRule="auto"/>
-        <w:ind w:left="1080"/>
-      </w:pPr>
-      <w:r>
-        <w:t>This is</w:t>
-      </w:r>
-      <w:r>
-        <w:t xml:space="preserve"> the design document for the Autonomous Cognitive Agent Flying Aircraft in X-Plane project. It outlines the overall architecture and design of the project, defining how the different software systems in the project interact with each other.</w:t>
-      </w:r>
-      <w:r>
-        <w:t xml:space="preserve"> Additionally, this document shows </w:t>
-      </w:r>
-      <w:r>
-        <w:t>a visual of the current UI implementation, as well as how we intend to expand the UI to work with the improvements to the current system we are attempting to make.</w:t>
-      </w:r>
-    </w:p>
-    <w:p>
-      <w:pPr>
-        <w:pStyle w:val="ListParagraph"/>
-        <w:numPr>
-          <w:ilvl w:val="1"/>
-          <w:numId w:val="9"/>
-        </w:numPr>
-        <w:spacing w:line="240" w:lineRule="auto"/>
-        <w:rPr>
-          <w:sz w:val="36"/>
-          <w:szCs w:val="36"/>
-        </w:rPr>
-      </w:pPr>
-      <w:r>
-        <w:rPr>
-          <w:b/>
-          <w:bCs/>
-          <w:sz w:val="36"/>
-          <w:szCs w:val="36"/>
-        </w:rPr>
-        <w:t>Scope</w:t>
-      </w:r>
-    </w:p>
-    <w:p>
-      <w:pPr>
-        <w:spacing w:line="240" w:lineRule="auto"/>
-        <w:ind w:left="1080"/>
-      </w:pPr>
-      <w:r>
-        <w:t xml:space="preserve">This software is intended to be a </w:t>
-      </w:r>
-      <w:r>
-        <w:t>SOAR Architecture agent</w:t>
-      </w:r>
-      <w:r>
-        <w:t xml:space="preserve"> that interacts with the X-Plane 12 flight simulator via the NASA Plugin XPC.</w:t>
-      </w:r>
-      <w:r>
-        <w:t xml:space="preserve"> The agent </w:t>
-      </w:r>
-      <w:r>
-        <w:t>will be flying the Beta Technologies Alia-250 VTOL aircraft in X-Plane</w:t>
-      </w:r>
-      <w:r>
-        <w:t>. The goal is to improve upon the existing agent that handles takeoff, landing, and flight to handle and react to various equipment failures that an aircraft could encounter mid-flight. This could mean diverting, or landing in a field even.</w:t>
-      </w:r>
-      <w:r>
-        <w:t xml:space="preserve"> The current agent handles single engine failure, </w:t>
-      </w:r>
-      <w:r>
-        <w:t xml:space="preserve">and </w:t>
-      </w:r>
-      <w:r>
-        <w:t xml:space="preserve">we plan on implementing </w:t>
-      </w:r>
-      <w:r>
-        <w:t>a system to handle various sensor failures such as GPS or IMU failures.</w:t>
-      </w:r>
-      <w:r>
-        <w:t xml:space="preserve"> The agent currently does not support</w:t>
-      </w:r>
-      <w:r>
-        <w:t xml:space="preserve"> dynamically modifying its route mid-flight, so we plan on implementing this later as well to assist with </w:t>
-      </w:r>
-      <w:r>
-        <w:t>engine failure management.</w:t>
-      </w:r>
-    </w:p>
-    <w:p>
-      <w:pPr>
-        <w:pStyle w:val="ListParagraph"/>
-        <w:numPr>
-          <w:ilvl w:val="1"/>
-          <w:numId w:val="9"/>
-        </w:numPr>
-        <w:spacing w:line="240" w:lineRule="auto"/>
-        <w:rPr>
-          <w:b/>
-          <w:bCs/>
-          <w:sz w:val="36"/>
-          <w:szCs w:val="36"/>
-        </w:rPr>
-      </w:pPr>
-      <w:r>
-        <w:rPr>
-          <w:b/>
-          <w:bCs/>
-          <w:sz w:val="36"/>
-          <w:szCs w:val="36"/>
-        </w:rPr>
-        <w:t>Intended Audience</w:t>
-      </w:r>
-    </w:p>
-    <w:p>
-      <w:pPr>
-        <w:spacing w:line="240" w:lineRule="auto"/>
-        <w:ind w:left="1080"/>
-      </w:pPr>
-      <w:r>
-        <w:t>The intended audience for this project is Dr. Siddhartha Bhattacharya</w:t>
-      </w:r>
-      <w:r>
-        <w:t>, the aviation community, and software developers. This project will be a part of the 2026</w:t>
-      </w:r>
-      <w:r>
-        <w:t xml:space="preserve"> Northrop Grumman</w:t>
-      </w:r>
-      <w:r>
-        <w:t xml:space="preserve"> Engineering and Design Showcase at the Florida Institute of Technology.</w:t>
-      </w:r>
-    </w:p>
-    <w:p>
-      <w:pPr>
-        <w:spacing w:line="240" w:lineRule="auto"/>
-        <w:ind w:left="1080"/>
-      </w:pPr>
-    </w:p>
-    <w:p>
-      <w:pPr>
-        <w:spacing w:line="240" w:lineRule="auto"/>
-        <w:ind w:left="1080"/>
-      </w:pPr>
-    </w:p>
-    <w:p>
-      <w:pPr>
-        <w:spacing w:line="240" w:lineRule="auto"/>
-        <w:ind w:left="1080"/>
-      </w:pPr>
-    </w:p>
-    <w:p>
-      <w:pPr>
-        <w:spacing w:line="240" w:lineRule="auto"/>
-        <w:ind w:left="1080"/>
-      </w:pPr>
-    </w:p>
-    <w:p>
-      <w:pPr>
-        <w:spacing w:line="240" w:lineRule="auto"/>
-        <w:ind w:left="1080"/>
-      </w:pPr>
-    </w:p>
-    <w:p>
-      <w:pPr>
-        <w:spacing w:line="240" w:lineRule="auto"/>
-        <w:ind w:left="1080"/>
-      </w:pPr>
-    </w:p>
-    <w:p>
-      <w:pPr>
-        <w:spacing w:line="240" w:lineRule="auto"/>
-        <w:ind w:left="1080"/>
-      </w:pPr>
-    </w:p>
-    <w:p>
-      <w:pPr>
-        <w:spacing w:line="240" w:lineRule="auto"/>
-        <w:ind w:left="1080"/>
-      </w:pPr>
-    </w:p>
-    <w:p>
-      <w:pPr>
-        <w:spacing w:line="240" w:lineRule="auto"/>
-        <w:ind w:left="1080"/>
-      </w:pPr>
-    </w:p>
-    <w:p>
-      <w:pPr>
-        <w:spacing w:line="240" w:lineRule="auto"/>
-      </w:pPr>
-    </w:p>
-    <w:p>
-      <w:pPr>
-        <w:pStyle w:val="ListParagraph"/>
-        <w:numPr>
-          <w:ilvl w:val="0"/>
-          <w:numId w:val="6"/>
-        </w:numPr>
-        <w:spacing w:line="240" w:lineRule="auto"/>
-        <w:rPr>
-          <w:b/>
-          <w:bCs/>
-          <w:sz w:val="48"/>
-          <w:szCs w:val="48"/>
-        </w:rPr>
-      </w:pPr>
-      <w:r>
-        <w:rPr>
-          <w:b/>
-          <w:bCs/>
-          <w:sz w:val="48"/>
-          <w:szCs w:val="48"/>
-        </w:rPr>
+      </w:pPr>
+      <w:bookmarkStart w:id="4" w:name="_Toc241079960"/>
+      <w:r>
         <w:lastRenderedPageBreak/>
         <w:t>Definitions and Acronyms</w:t>
       </w:r>
+      <w:bookmarkEnd w:id="4"/>
     </w:p>
     <w:p>
       <w:pPr>
@@ -1165,27 +2411,14 @@
         <w:t>QGC</w:t>
       </w:r>
       <w:r>
-        <w:t xml:space="preserve"> (</w:t>
-      </w:r>
-      <w:proofErr w:type="spellStart"/>
-      <w:r>
-        <w:t>QGround</w:t>
-      </w:r>
-      <w:proofErr w:type="spellEnd"/>
-      <w:r>
-        <w:t xml:space="preserve"> Control): </w:t>
+        <w:t xml:space="preserve"> (QGround Control): </w:t>
       </w:r>
       <w:r>
         <w:t>Open-source ground control station for</w:t>
       </w:r>
       <w:r>
-        <w:t xml:space="preserve"> any </w:t>
-      </w:r>
-      <w:proofErr w:type="spellStart"/>
-      <w:r>
-        <w:t>MAVLink</w:t>
-      </w:r>
-      <w:proofErr w:type="spellEnd"/>
+        <w:t xml:space="preserve"> any MAVLink</w:t>
+      </w:r>
       <w:r>
         <w:t xml:space="preserve"> enabled vehicle</w:t>
       </w:r>
@@ -1199,7 +2432,6 @@
         <w:spacing w:line="240" w:lineRule="auto"/>
         <w:ind w:left="360"/>
       </w:pPr>
-      <w:proofErr w:type="spellStart"/>
       <w:r>
         <w:rPr>
           <w:b/>
@@ -1207,7 +2439,6 @@
         </w:rPr>
         <w:t>MAVLink</w:t>
       </w:r>
-      <w:proofErr w:type="spellEnd"/>
       <w:r>
         <w:t xml:space="preserve"> (Micro Air Vehicle Link): Lightweight communication protocol used to send data </w:t>
       </w:r>
@@ -1264,7 +2495,6 @@
         <w:spacing w:line="240" w:lineRule="auto"/>
         <w:ind w:left="360"/>
       </w:pPr>
-      <w:proofErr w:type="spellStart"/>
       <w:r>
         <w:rPr>
           <w:b/>
@@ -1272,7 +2502,6 @@
         </w:rPr>
         <w:t>Datarefs</w:t>
       </w:r>
-      <w:proofErr w:type="spellEnd"/>
       <w:r>
         <w:t xml:space="preserve">: </w:t>
       </w:r>
@@ -1423,123 +2652,102 @@
     </w:p>
     <w:p>
       <w:pPr>
-        <w:pStyle w:val="ListParagraph"/>
+        <w:pStyle w:val="Heading1"/>
         <w:numPr>
           <w:ilvl w:val="0"/>
-          <w:numId w:val="6"/>
+          <w:numId w:val="21"/>
         </w:numPr>
-        <w:spacing w:line="240" w:lineRule="auto"/>
+      </w:pPr>
+      <w:bookmarkStart w:id="5" w:name="_Toc241079961"/>
+      <w:r>
+        <w:rPr>
+          <w:rStyle w:val="Heading1Char"/>
+        </w:rPr>
+        <w:lastRenderedPageBreak/>
+        <w:t>System</w:t>
+      </w:r>
+      <w:r>
+        <w:t xml:space="preserve"> Design</w:t>
+      </w:r>
+      <w:bookmarkEnd w:id="5"/>
+    </w:p>
+    <w:p>
+      <w:pPr>
+        <w:pStyle w:val="Heading2"/>
+        <w:numPr>
+          <w:ilvl w:val="1"/>
+          <w:numId w:val="21"/>
+        </w:numPr>
         <w:rPr>
           <w:sz w:val="48"/>
           <w:szCs w:val="48"/>
         </w:rPr>
       </w:pPr>
-      <w:r>
-        <w:rPr>
-          <w:b/>
-          <w:bCs/>
-          <w:sz w:val="48"/>
-          <w:szCs w:val="48"/>
-        </w:rPr>
-        <w:lastRenderedPageBreak/>
-        <w:t>System Design</w:t>
-      </w:r>
+      <w:bookmarkStart w:id="6" w:name="_Toc241079962"/>
+      <w:r>
+        <w:t>Design Overview</w:t>
+      </w:r>
+      <w:bookmarkEnd w:id="6"/>
     </w:p>
     <w:p>
       <w:pPr>
         <w:pStyle w:val="ListParagraph"/>
+        <w:spacing w:line="240" w:lineRule="auto"/>
+        <w:ind w:left="792"/>
+      </w:pPr>
+      <w:r>
+        <w:t xml:space="preserve">The </w:t>
+      </w:r>
+      <w:r>
+        <w:t xml:space="preserve">agent </w:t>
+      </w:r>
+      <w:r>
+        <w:t xml:space="preserve">communicates with X-Plane 12 </w:t>
+      </w:r>
+      <w:r>
+        <w:t xml:space="preserve">through the X-Plane Connect </w:t>
+      </w:r>
+      <w:r>
+        <w:t xml:space="preserve">plugin to get details about the aircraft’s flight through datarefs. </w:t>
+      </w:r>
+      <w:r>
+        <w:t>XPC will send this data to the SOAR agent. T</w:t>
+      </w:r>
+      <w:r>
+        <w:t xml:space="preserve">he GUI is constantly updated with flight information. The user will trigger equipment and sensor failures </w:t>
+      </w:r>
+      <w:r>
+        <w:t xml:space="preserve">through the GUI. The GUI will give this faulty sensor data to XPC, which will then be picked up by the agent. The agent will then </w:t>
+      </w:r>
+      <w:r>
+        <w:t xml:space="preserve">process the flight data along with failures to determine the best course of action. The agent will then make its decision and send instructions back to XPC. XPC will then feed this information </w:t>
+      </w:r>
+      <w:r>
+        <w:t>to X-Plane 12 where the aircraft flight is controlled by the agent input.</w:t>
+      </w:r>
+      <w:r>
+        <w:t xml:space="preserve"> The </w:t>
+      </w:r>
+      <w:r>
+        <w:t>CCAT program reads from the apt.dat file</w:t>
+      </w:r>
+      <w:r>
+        <w:t xml:space="preserve"> to find suitable airports to divert to if necessary. The coordinates for these are passed to the agent for decision making, and the previous cycle repeats.</w:t>
+      </w:r>
+    </w:p>
+    <w:p>
+      <w:pPr>
+        <w:pStyle w:val="Heading2"/>
         <w:numPr>
           <w:ilvl w:val="1"/>
-          <w:numId w:val="6"/>
+          <w:numId w:val="21"/>
         </w:numPr>
-        <w:spacing w:line="240" w:lineRule="auto"/>
-        <w:rPr>
-          <w:sz w:val="48"/>
-          <w:szCs w:val="48"/>
-        </w:rPr>
-      </w:pPr>
-      <w:r>
-        <w:rPr>
-          <w:b/>
-          <w:bCs/>
-          <w:sz w:val="36"/>
-          <w:szCs w:val="36"/>
-        </w:rPr>
-        <w:t>Design Overview</w:t>
-      </w:r>
-    </w:p>
-    <w:p>
-      <w:pPr>
-        <w:pStyle w:val="ListParagraph"/>
-        <w:spacing w:line="240" w:lineRule="auto"/>
-        <w:ind w:left="792"/>
-      </w:pPr>
-      <w:r>
-        <w:t xml:space="preserve">The </w:t>
-      </w:r>
-      <w:r>
-        <w:t xml:space="preserve">agent </w:t>
-      </w:r>
-      <w:r>
-        <w:t xml:space="preserve">communicates with X-Plane 12 </w:t>
-      </w:r>
-      <w:r>
-        <w:t xml:space="preserve">through the X-Plane Connect </w:t>
-      </w:r>
-      <w:r>
-        <w:t xml:space="preserve">plugin to get details about the aircraft’s flight through </w:t>
-      </w:r>
-      <w:proofErr w:type="spellStart"/>
-      <w:r>
-        <w:t>datarefs</w:t>
-      </w:r>
-      <w:proofErr w:type="spellEnd"/>
-      <w:r>
-        <w:t xml:space="preserve">. </w:t>
-      </w:r>
-      <w:r>
-        <w:t>XPC will send this data to the SOAR agent. T</w:t>
-      </w:r>
-      <w:r>
-        <w:t xml:space="preserve">he GUI is constantly updated with flight information. The user will trigger equipment and sensor failures </w:t>
-      </w:r>
-      <w:r>
-        <w:t xml:space="preserve">through the GUI. The GUI will give this faulty sensor data to XPC, which will then be picked up by the agent. The agent will then </w:t>
-      </w:r>
-      <w:r>
-        <w:t xml:space="preserve">process the flight data along with failures to determine the best course of action. The agent will then make its decision and send instructions back to XPC. XPC will then feed this information </w:t>
-      </w:r>
-      <w:r>
-        <w:t>to X-Plane 12 where the aircraft flight is controlled by the agent input.</w:t>
-      </w:r>
-      <w:r>
-        <w:t xml:space="preserve"> The </w:t>
-      </w:r>
-      <w:r>
-        <w:t>CCAT program reads from the apt.dat file</w:t>
-      </w:r>
-      <w:r>
-        <w:t xml:space="preserve"> to find suitable airports to divert to if necessary. The coordinates for these are passed to the agent for decision making, and the previous cycle repeats.</w:t>
-      </w:r>
-    </w:p>
-    <w:p>
-      <w:pPr>
-        <w:pStyle w:val="ListParagraph"/>
-        <w:numPr>
-          <w:ilvl w:val="1"/>
-          <w:numId w:val="6"/>
-        </w:numPr>
-        <w:spacing w:line="240" w:lineRule="auto"/>
-      </w:pPr>
-      <w:r>
-        <w:rPr>
-          <w:b/>
-          <w:bCs/>
-          <w:sz w:val="36"/>
-          <w:szCs w:val="36"/>
-        </w:rPr>
+      </w:pPr>
+      <w:bookmarkStart w:id="7" w:name="_Toc241079963"/>
+      <w:r>
         <w:t>System Architecture</w:t>
       </w:r>
+      <w:bookmarkEnd w:id="7"/>
     </w:p>
     <w:p>
       <w:pPr>
@@ -1625,56 +2833,39 @@
     </w:p>
     <w:p>
       <w:pPr>
-        <w:pStyle w:val="ListParagraph"/>
-        <w:spacing w:line="240" w:lineRule="auto"/>
-        <w:ind w:left="792"/>
-      </w:pPr>
-    </w:p>
-    <w:p>
-      <w:pPr>
-        <w:pStyle w:val="ListParagraph"/>
+        <w:pStyle w:val="Heading1"/>
         <w:numPr>
           <w:ilvl w:val="0"/>
-          <w:numId w:val="6"/>
+          <w:numId w:val="21"/>
         </w:numPr>
-        <w:spacing w:line="240" w:lineRule="auto"/>
-      </w:pPr>
-      <w:r>
-        <w:rPr>
-          <w:b/>
-          <w:bCs/>
-          <w:sz w:val="48"/>
-          <w:szCs w:val="48"/>
-        </w:rPr>
+      </w:pPr>
+      <w:bookmarkStart w:id="8" w:name="_Toc241079964"/>
+      <w:r>
         <w:lastRenderedPageBreak/>
         <w:t>Component Design</w:t>
       </w:r>
-    </w:p>
-    <w:p>
-      <w:pPr>
-        <w:pStyle w:val="ListParagraph"/>
+      <w:bookmarkEnd w:id="8"/>
+    </w:p>
+    <w:p>
+      <w:pPr>
+        <w:pStyle w:val="Heading2"/>
         <w:numPr>
           <w:ilvl w:val="1"/>
-          <w:numId w:val="6"/>
+          <w:numId w:val="21"/>
         </w:numPr>
-        <w:spacing w:line="240" w:lineRule="auto"/>
-      </w:pPr>
-      <w:r>
-        <w:rPr>
-          <w:b/>
-          <w:bCs/>
-          <w:sz w:val="36"/>
-          <w:szCs w:val="36"/>
-        </w:rPr>
+      </w:pPr>
+      <w:bookmarkStart w:id="9" w:name="_Toc241079965"/>
+      <w:r>
         <w:t>CCAT</w:t>
       </w:r>
+      <w:bookmarkEnd w:id="9"/>
     </w:p>
     <w:p>
       <w:pPr>
         <w:pStyle w:val="ListParagraph"/>
         <w:numPr>
           <w:ilvl w:val="2"/>
-          <w:numId w:val="6"/>
+          <w:numId w:val="21"/>
         </w:numPr>
         <w:spacing w:line="240" w:lineRule="auto"/>
       </w:pPr>
@@ -1693,29 +2884,24 @@
     </w:p>
     <w:p>
       <w:pPr>
-        <w:pStyle w:val="ListParagraph"/>
+        <w:pStyle w:val="Heading3"/>
         <w:numPr>
           <w:ilvl w:val="1"/>
-          <w:numId w:val="6"/>
+          <w:numId w:val="21"/>
         </w:numPr>
-        <w:spacing w:line="240" w:lineRule="auto"/>
-      </w:pPr>
-      <w:r>
-        <w:rPr>
-          <w:b/>
-          <w:bCs/>
-          <w:sz w:val="36"/>
-          <w:szCs w:val="36"/>
-        </w:rPr>
+      </w:pPr>
+      <w:bookmarkStart w:id="10" w:name="_Toc241079966"/>
+      <w:r>
         <w:t>Soar Agent</w:t>
       </w:r>
+      <w:bookmarkEnd w:id="10"/>
     </w:p>
     <w:p>
       <w:pPr>
         <w:pStyle w:val="ListParagraph"/>
         <w:numPr>
           <w:ilvl w:val="2"/>
-          <w:numId w:val="6"/>
+          <w:numId w:val="21"/>
         </w:numPr>
         <w:spacing w:line="240" w:lineRule="auto"/>
       </w:pPr>
@@ -1738,42 +2924,29 @@
         <w:t xml:space="preserve"> to divert.</w:t>
       </w:r>
       <w:r>
-        <w:t xml:space="preserve"> The SOAR agent is written using SOAR production rules that are read in by the CCAT Java harness program. SOAR production rules are </w:t>
-      </w:r>
-      <w:proofErr w:type="spellStart"/>
-      <w:r>
-        <w:t>boolean</w:t>
-      </w:r>
-      <w:proofErr w:type="spellEnd"/>
-      <w:r>
-        <w:t xml:space="preserve"> rules that the agent uses to determine its course of action.</w:t>
-      </w:r>
-    </w:p>
-    <w:p>
-      <w:pPr>
-        <w:pStyle w:val="ListParagraph"/>
+        <w:t xml:space="preserve"> The SOAR agent is written using SOAR production rules that are read in by the CCAT Java harness program. SOAR production rules are boolean rules that the agent uses to determine its course of action.</w:t>
+      </w:r>
+    </w:p>
+    <w:p>
+      <w:pPr>
+        <w:pStyle w:val="Heading3"/>
         <w:numPr>
           <w:ilvl w:val="1"/>
-          <w:numId w:val="6"/>
+          <w:numId w:val="21"/>
         </w:numPr>
-        <w:spacing w:line="240" w:lineRule="auto"/>
-      </w:pPr>
-      <w:r>
-        <w:rPr>
-          <w:b/>
-          <w:bCs/>
-          <w:sz w:val="36"/>
-          <w:szCs w:val="36"/>
-        </w:rPr>
+      </w:pPr>
+      <w:bookmarkStart w:id="11" w:name="_Toc241079967"/>
+      <w:r>
         <w:t>GUI</w:t>
       </w:r>
+      <w:bookmarkEnd w:id="11"/>
     </w:p>
     <w:p>
       <w:pPr>
         <w:pStyle w:val="ListParagraph"/>
         <w:numPr>
           <w:ilvl w:val="2"/>
-          <w:numId w:val="6"/>
+          <w:numId w:val="21"/>
         </w:numPr>
         <w:spacing w:line="240" w:lineRule="auto"/>
       </w:pPr>
@@ -1810,161 +2983,100 @@
     </w:p>
     <w:p>
       <w:pPr>
-        <w:pStyle w:val="ListParagraph"/>
+        <w:pStyle w:val="Heading3"/>
         <w:numPr>
           <w:ilvl w:val="1"/>
-          <w:numId w:val="6"/>
+          <w:numId w:val="21"/>
         </w:numPr>
-        <w:spacing w:line="240" w:lineRule="auto"/>
-      </w:pPr>
-      <w:proofErr w:type="spellStart"/>
-      <w:r>
-        <w:rPr>
-          <w:b/>
-          <w:bCs/>
-          <w:sz w:val="36"/>
-          <w:szCs w:val="36"/>
-        </w:rPr>
+      </w:pPr>
+      <w:bookmarkStart w:id="12" w:name="_Toc241079968"/>
+      <w:r>
         <w:t>Datarefs</w:t>
       </w:r>
-      <w:proofErr w:type="spellEnd"/>
+      <w:bookmarkEnd w:id="12"/>
     </w:p>
     <w:p>
       <w:pPr>
         <w:pStyle w:val="ListParagraph"/>
         <w:numPr>
           <w:ilvl w:val="2"/>
-          <w:numId w:val="6"/>
+          <w:numId w:val="21"/>
         </w:numPr>
         <w:spacing w:line="240" w:lineRule="auto"/>
       </w:pPr>
       <w:r>
-        <w:t xml:space="preserve">We plan to use various X-Plane 12 </w:t>
-      </w:r>
-      <w:proofErr w:type="spellStart"/>
-      <w:r>
-        <w:t>datarefs</w:t>
-      </w:r>
-      <w:proofErr w:type="spellEnd"/>
-      <w:r>
-        <w:t xml:space="preserve"> to provide the agent with </w:t>
-      </w:r>
-      <w:r>
-        <w:t xml:space="preserve">the correct flight information. X-Plane has </w:t>
-      </w:r>
-      <w:proofErr w:type="spellStart"/>
-      <w:r>
-        <w:t>datarefs</w:t>
-      </w:r>
-      <w:proofErr w:type="spellEnd"/>
-      <w:r>
-        <w:t xml:space="preserve"> that allow for manipulation of flight data to simulate sensor data. The agent will </w:t>
-      </w:r>
-      <w:r>
-        <w:t xml:space="preserve">read data from the cherry-picked </w:t>
-      </w:r>
-      <w:proofErr w:type="spellStart"/>
-      <w:r>
-        <w:t>datarers</w:t>
-      </w:r>
-      <w:proofErr w:type="spellEnd"/>
-      <w:r>
-        <w:t xml:space="preserve"> to determine the failure and react accordingly.</w:t>
-      </w:r>
-    </w:p>
-    <w:p>
-      <w:pPr>
-        <w:spacing w:line="240" w:lineRule="auto"/>
-      </w:pPr>
-    </w:p>
-    <w:p>
-      <w:pPr>
-        <w:spacing w:line="240" w:lineRule="auto"/>
-      </w:pPr>
-    </w:p>
-    <w:p>
-      <w:pPr>
-        <w:spacing w:line="240" w:lineRule="auto"/>
-      </w:pPr>
-    </w:p>
-    <w:p>
-      <w:pPr>
-        <w:spacing w:line="240" w:lineRule="auto"/>
-      </w:pPr>
-    </w:p>
-    <w:p>
-      <w:pPr>
-        <w:spacing w:line="240" w:lineRule="auto"/>
-      </w:pPr>
-    </w:p>
-    <w:p>
-      <w:pPr>
-        <w:spacing w:line="240" w:lineRule="auto"/>
-      </w:pPr>
-    </w:p>
-    <w:p>
-      <w:pPr>
-        <w:spacing w:line="240" w:lineRule="auto"/>
-      </w:pPr>
-    </w:p>
-    <w:p>
-      <w:pPr>
-        <w:spacing w:line="240" w:lineRule="auto"/>
-      </w:pPr>
-    </w:p>
-    <w:p>
-      <w:pPr>
-        <w:spacing w:line="240" w:lineRule="auto"/>
-      </w:pPr>
-    </w:p>
-    <w:p>
-      <w:pPr>
-        <w:spacing w:line="240" w:lineRule="auto"/>
-      </w:pPr>
-    </w:p>
-    <w:p>
-      <w:pPr>
-        <w:spacing w:line="240" w:lineRule="auto"/>
-      </w:pPr>
-    </w:p>
-    <w:p>
-      <w:pPr>
-        <w:pStyle w:val="ListParagraph"/>
+        <w:t xml:space="preserve">We plan to use various X-Plane 12 datarefs to provide the agent with </w:t>
+      </w:r>
+      <w:r>
+        <w:t xml:space="preserve">the correct flight information. X-Plane has datarefs that allow for manipulation of flight data to simulate sensor data. The agent will </w:t>
+      </w:r>
+      <w:r>
+        <w:t>read data from the cherry-picked datarers to determine the failure and react accordingly.</w:t>
+      </w:r>
+    </w:p>
+    <w:p>
+      <w:pPr>
+        <w:spacing w:line="240" w:lineRule="auto"/>
+      </w:pPr>
+    </w:p>
+    <w:p>
+      <w:pPr>
+        <w:spacing w:line="240" w:lineRule="auto"/>
+      </w:pPr>
+    </w:p>
+    <w:p>
+      <w:pPr>
+        <w:spacing w:line="240" w:lineRule="auto"/>
+      </w:pPr>
+    </w:p>
+    <w:p>
+      <w:pPr>
+        <w:spacing w:line="240" w:lineRule="auto"/>
+      </w:pPr>
+    </w:p>
+    <w:p>
+      <w:pPr>
+        <w:spacing w:line="240" w:lineRule="auto"/>
+      </w:pPr>
+    </w:p>
+    <w:p>
+      <w:pPr>
+        <w:spacing w:line="240" w:lineRule="auto"/>
+      </w:pPr>
+    </w:p>
+    <w:p>
+      <w:pPr>
+        <w:spacing w:line="240" w:lineRule="auto"/>
+      </w:pPr>
+    </w:p>
+    <w:p>
+      <w:pPr>
+        <w:pStyle w:val="Heading1"/>
         <w:numPr>
           <w:ilvl w:val="0"/>
-          <w:numId w:val="6"/>
+          <w:numId w:val="21"/>
         </w:numPr>
-        <w:spacing w:line="240" w:lineRule="auto"/>
-      </w:pPr>
-      <w:r>
-        <w:rPr>
-          <w:b/>
-          <w:bCs/>
-          <w:sz w:val="48"/>
-          <w:szCs w:val="48"/>
-        </w:rPr>
+      </w:pPr>
+      <w:bookmarkStart w:id="13" w:name="_Toc241079969"/>
+      <w:r>
         <w:lastRenderedPageBreak/>
         <w:t>User Interface Design</w:t>
       </w:r>
-    </w:p>
-    <w:p>
-      <w:pPr>
-        <w:pStyle w:val="ListParagraph"/>
+      <w:bookmarkEnd w:id="13"/>
+    </w:p>
+    <w:p>
+      <w:pPr>
+        <w:pStyle w:val="Heading2"/>
         <w:numPr>
           <w:ilvl w:val="1"/>
-          <w:numId w:val="6"/>
+          <w:numId w:val="21"/>
         </w:numPr>
-        <w:spacing w:line="240" w:lineRule="auto"/>
-      </w:pPr>
-      <w:r>
-        <w:rPr>
-          <w:b/>
-          <w:bCs/>
-          <w:sz w:val="36"/>
-          <w:szCs w:val="36"/>
-        </w:rPr>
+      </w:pPr>
+      <w:bookmarkStart w:id="14" w:name="_Toc241079970"/>
+      <w:r>
         <w:t>Overview of User Interface Design</w:t>
       </w:r>
+      <w:bookmarkEnd w:id="14"/>
     </w:p>
     <w:p>
       <w:pPr>
@@ -1998,32 +3110,313 @@
     </w:p>
     <w:p>
       <w:pPr>
-        <w:pStyle w:val="ListParagraph"/>
+        <w:pStyle w:val="Heading2"/>
         <w:numPr>
           <w:ilvl w:val="1"/>
-          <w:numId w:val="6"/>
+          <w:numId w:val="21"/>
         </w:numPr>
-        <w:spacing w:line="240" w:lineRule="auto"/>
-      </w:pPr>
-      <w:r>
+      </w:pPr>
+      <w:bookmarkStart w:id="15" w:name="_Toc241079971"/>
+      <w:r>
+        <w:t>User Interface Screen Images</w:t>
+      </w:r>
+      <w:bookmarkEnd w:id="15"/>
+    </w:p>
+    <w:p>
+      <w:pPr>
+        <w:pStyle w:val="ListParagraph"/>
+        <w:spacing w:line="240" w:lineRule="auto"/>
+        <w:ind w:left="0"/>
+      </w:pPr>
+      <w:r>
+        <w:drawing>
+          <wp:inline distT="0" distB="0" distL="0" distR="0" wp14:anchorId="3E516993" wp14:editId="0FE32553">
+            <wp:extent cx="5560697" cy="4924425"/>
+            <wp:effectExtent l="0" t="0" r="1905" b="0"/>
+            <wp:docPr id="1500592907" name="Picture 1"/>
+            <wp:cNvGraphicFramePr>
+              <a:graphicFrameLocks xmlns:a="http://schemas.openxmlformats.org/drawingml/2006/main" noChangeAspect="1"/>
+            </wp:cNvGraphicFramePr>
+            <a:graphic xmlns:a="http://schemas.openxmlformats.org/drawingml/2006/main">
+              <a:graphicData uri="http://schemas.openxmlformats.org/drawingml/2006/picture">
+                <pic:pic xmlns:pic="http://schemas.openxmlformats.org/drawingml/2006/picture">
+                  <pic:nvPicPr>
+                    <pic:cNvPr id="1500592907" name=""/>
+                    <pic:cNvPicPr/>
+                  </pic:nvPicPr>
+                  <pic:blipFill>
+                    <a:blip r:embed="rId9"/>
+                    <a:stretch>
+                      <a:fillRect/>
+                    </a:stretch>
+                  </pic:blipFill>
+                  <pic:spPr>
+                    <a:xfrm>
+                      <a:off x="0" y="0"/>
+                      <a:ext cx="5564004" cy="4927354"/>
+                    </a:xfrm>
+                    <a:prstGeom prst="rect">
+                      <a:avLst/>
+                    </a:prstGeom>
+                  </pic:spPr>
+                </pic:pic>
+              </a:graphicData>
+            </a:graphic>
+          </wp:inline>
+        </w:drawing>
+      </w:r>
+    </w:p>
+    <w:p>
+      <w:pPr>
+        <w:pStyle w:val="ListParagraph"/>
+        <w:spacing w:line="240" w:lineRule="auto"/>
+        <w:ind w:left="0"/>
+      </w:pPr>
+      <w:r>
+        <w:lastRenderedPageBreak/>
+        <w:drawing>
+          <wp:inline distT="0" distB="0" distL="0" distR="0" wp14:anchorId="6C1AF6ED" wp14:editId="7818FF5A">
+            <wp:extent cx="5427860" cy="3695700"/>
+            <wp:effectExtent l="0" t="0" r="1905" b="0"/>
+            <wp:docPr id="1831446190" name="Picture 1"/>
+            <wp:cNvGraphicFramePr>
+              <a:graphicFrameLocks xmlns:a="http://schemas.openxmlformats.org/drawingml/2006/main" noChangeAspect="1"/>
+            </wp:cNvGraphicFramePr>
+            <a:graphic xmlns:a="http://schemas.openxmlformats.org/drawingml/2006/main">
+              <a:graphicData uri="http://schemas.openxmlformats.org/drawingml/2006/picture">
+                <pic:pic xmlns:pic="http://schemas.openxmlformats.org/drawingml/2006/picture">
+                  <pic:nvPicPr>
+                    <pic:cNvPr id="1831446190" name=""/>
+                    <pic:cNvPicPr/>
+                  </pic:nvPicPr>
+                  <pic:blipFill>
+                    <a:blip r:embed="rId10"/>
+                    <a:stretch>
+                      <a:fillRect/>
+                    </a:stretch>
+                  </pic:blipFill>
+                  <pic:spPr>
+                    <a:xfrm>
+                      <a:off x="0" y="0"/>
+                      <a:ext cx="5431487" cy="3698170"/>
+                    </a:xfrm>
+                    <a:prstGeom prst="rect">
+                      <a:avLst/>
+                    </a:prstGeom>
+                  </pic:spPr>
+                </pic:pic>
+              </a:graphicData>
+            </a:graphic>
+          </wp:inline>
+        </w:drawing>
+      </w:r>
+    </w:p>
+    <w:p>
+      <w:pPr>
+        <w:pStyle w:val="ListParagraph"/>
+        <w:spacing w:line="240" w:lineRule="auto"/>
+        <w:ind w:left="0"/>
+      </w:pPr>
+      <w:r>
+        <w:drawing>
+          <wp:inline distT="0" distB="0" distL="0" distR="0" wp14:anchorId="51A6161F" wp14:editId="0F1B077F">
+            <wp:extent cx="4836524" cy="4152900"/>
+            <wp:effectExtent l="0" t="0" r="2540" b="0"/>
+            <wp:docPr id="2027658636" name="Picture 1"/>
+            <wp:cNvGraphicFramePr>
+              <a:graphicFrameLocks xmlns:a="http://schemas.openxmlformats.org/drawingml/2006/main" noChangeAspect="1"/>
+            </wp:cNvGraphicFramePr>
+            <a:graphic xmlns:a="http://schemas.openxmlformats.org/drawingml/2006/main">
+              <a:graphicData uri="http://schemas.openxmlformats.org/drawingml/2006/picture">
+                <pic:pic xmlns:pic="http://schemas.openxmlformats.org/drawingml/2006/picture">
+                  <pic:nvPicPr>
+                    <pic:cNvPr id="2027658636" name=""/>
+                    <pic:cNvPicPr/>
+                  </pic:nvPicPr>
+                  <pic:blipFill>
+                    <a:blip r:embed="rId11"/>
+                    <a:stretch>
+                      <a:fillRect/>
+                    </a:stretch>
+                  </pic:blipFill>
+                  <pic:spPr>
+                    <a:xfrm>
+                      <a:off x="0" y="0"/>
+                      <a:ext cx="4840667" cy="4156458"/>
+                    </a:xfrm>
+                    <a:prstGeom prst="rect">
+                      <a:avLst/>
+                    </a:prstGeom>
+                  </pic:spPr>
+                </pic:pic>
+              </a:graphicData>
+            </a:graphic>
+          </wp:inline>
+        </w:drawing>
+      </w:r>
+    </w:p>
+    <w:p>
+      <w:pPr>
+        <w:pStyle w:val="Heading2"/>
+        <w:numPr>
+          <w:ilvl w:val="1"/>
+          <w:numId w:val="21"/>
+        </w:numPr>
         <w:rPr>
-          <w:b/>
-          <w:bCs/>
-          <w:sz w:val="36"/>
-          <w:szCs w:val="36"/>
+          <w:sz w:val="24"/>
+          <w:szCs w:val="24"/>
         </w:rPr>
-        <w:t>User Interface Screen Images</w:t>
-      </w:r>
+      </w:pPr>
+      <w:bookmarkStart w:id="16" w:name="_Toc241079972"/>
+      <w:r>
+        <w:lastRenderedPageBreak/>
+        <w:t>User Interface Objects and Actions</w:t>
+      </w:r>
+      <w:bookmarkEnd w:id="16"/>
     </w:p>
     <w:p>
       <w:pPr>
         <w:pStyle w:val="ListParagraph"/>
         <w:spacing w:line="240" w:lineRule="auto"/>
-        <w:ind w:left="0"/>
-      </w:pPr>
+        <w:ind w:left="792"/>
+      </w:pPr>
+      <w:r>
+        <w:t>The first portion of the user interface shows the current sensor data. The agent currently relies on GPS, IMU, and Lidar for its navigation. It also shows the distance to its target waypoint, and a button to initiate a landing. The other window in the first image shows the UI for testing the agent. One can simulate errors with that portion.</w:t>
+      </w:r>
+    </w:p>
+    <w:p>
+      <w:pPr>
+        <w:pStyle w:val="ListParagraph"/>
+        <w:spacing w:line="240" w:lineRule="auto"/>
+        <w:ind w:left="792"/>
+      </w:pPr>
+      <w:r>
+        <w:t xml:space="preserve">The second image shows the status of </w:t>
+      </w:r>
+      <w:r>
+        <w:t>agent</w:t>
+      </w:r>
+      <w:r>
+        <w:t xml:space="preserve"> training</w:t>
+      </w:r>
+      <w:r>
+        <w:t xml:space="preserve">. It has different displays for the different </w:t>
+      </w:r>
+      <w:r>
+        <w:t>values of the agent</w:t>
+      </w:r>
+      <w:r>
+        <w:t>’s variables and states for SOAR.</w:t>
+      </w:r>
+    </w:p>
+    <w:p>
+      <w:pPr>
+        <w:pStyle w:val="ListParagraph"/>
+        <w:spacing w:line="240" w:lineRule="auto"/>
+        <w:ind w:left="792"/>
+      </w:pPr>
+      <w:r>
+        <w:t xml:space="preserve">The final screen image shows the debugging window, which shows all the </w:t>
+      </w:r>
+      <w:r>
+        <w:t xml:space="preserve">state transitions and more for the </w:t>
+      </w:r>
+      <w:r>
+        <w:t>SOAR agent.</w:t>
+      </w:r>
+      <w:r>
+        <w:t xml:space="preserve"> It shows stack trace and more for simple debugging of the agent.</w:t>
+      </w:r>
+    </w:p>
+    <w:p>
+      <w:pPr>
+        <w:pStyle w:val="Heading1"/>
+        <w:numPr>
+          <w:ilvl w:val="0"/>
+          <w:numId w:val="21"/>
+        </w:numPr>
+        <w:rPr>
+          <w:sz w:val="24"/>
+          <w:szCs w:val="24"/>
+        </w:rPr>
+      </w:pPr>
+      <w:bookmarkStart w:id="17" w:name="_Toc241079973"/>
+      <w:r>
+        <w:t>Appendix</w:t>
+      </w:r>
+      <w:bookmarkEnd w:id="17"/>
+    </w:p>
+    <w:p>
+      <w:pPr>
+        <w:pStyle w:val="Heading2"/>
+        <w:numPr>
+          <w:ilvl w:val="1"/>
+          <w:numId w:val="21"/>
+        </w:numPr>
+        <w:rPr>
+          <w:sz w:val="24"/>
+          <w:szCs w:val="24"/>
+        </w:rPr>
+      </w:pPr>
+      <w:bookmarkStart w:id="18" w:name="_Toc241079974"/>
+      <w:r>
+        <w:t>Planned Additions to Existing Software</w:t>
+      </w:r>
+      <w:bookmarkEnd w:id="18"/>
+    </w:p>
+    <w:p>
+      <w:pPr>
+        <w:pStyle w:val="ListParagraph"/>
+        <w:spacing w:line="240" w:lineRule="auto"/>
+      </w:pPr>
+      <w:r>
+        <w:t>We are building on an existing system. Most of this architecture was already built before the initiation of this project. But the emphasis is not on building a new system, it is more on the AI side of this. Our goal is to build on this existing agent to handle multiple equipment failures and dynamically modify its flight plan</w:t>
+      </w:r>
+      <w:r>
+        <w:t xml:space="preserve"> mid-flight, which is beyond the agent’s current capabilities.</w:t>
+      </w:r>
+    </w:p>
+    <w:p>
+      <w:pPr>
+        <w:pStyle w:val="Heading2"/>
+        <w:numPr>
+          <w:ilvl w:val="1"/>
+          <w:numId w:val="21"/>
+        </w:numPr>
+        <w:rPr>
+          <w:sz w:val="24"/>
+          <w:szCs w:val="24"/>
+        </w:rPr>
+      </w:pPr>
+      <w:bookmarkStart w:id="19" w:name="_Toc241079975"/>
+      <w:r>
+        <w:t>Current State of Agent</w:t>
+      </w:r>
+      <w:bookmarkEnd w:id="19"/>
+    </w:p>
+    <w:p>
+      <w:pPr>
+        <w:pStyle w:val="ListParagraph"/>
+        <w:spacing w:line="240" w:lineRule="auto"/>
+      </w:pPr>
+      <w:r>
+        <w:t xml:space="preserve">The agent already has rules for </w:t>
+      </w:r>
+      <w:r>
+        <w:t>landing and taking off, but it lacks a high-level controller to orchestrate the components. Our demo is a simple SOAR file that gets the agent to altitude and has it cruise to demo the system.</w:t>
+      </w:r>
+      <w:r>
+        <w:t xml:space="preserve"> We will utilize </w:t>
+      </w:r>
+      <w:r>
+        <w:t>all</w:t>
+      </w:r>
+      <w:r>
+        <w:t xml:space="preserve"> the existing SOAR files in designing the new high-level .soar file that orchestrates the entire flight plan.</w:t>
+      </w:r>
     </w:p>
     <w:sectPr>
-      <w:footerReference w:type="default" r:id="rId9"/>
+      <w:footerReference w:type="default" r:id="rId12"/>
       <w:pgSz w:w="12240" w:h="15840"/>
       <w:pgMar w:top="1440" w:right="1440" w:bottom="1440" w:left="1440" w:header="720" w:footer="720" w:gutter="0"/>
       <w:cols w:space="720"/>
@@ -2323,6 +3716,95 @@
     </w:lvl>
   </w:abstractNum>
   <w:abstractNum w:abstractNumId="2" w15:restartNumberingAfterBreak="0">
+    <w:nsid w:val="17DF78C1"/>
+    <w:multiLevelType w:val="hybridMultilevel"/>
+    <w:tmpl w:val="EE2813D4"/>
+    <w:lvl w:ilvl="0" w:tplc="0409000F">
+      <w:start w:val="1"/>
+      <w:numFmt w:val="decimal"/>
+      <w:lvlText w:val="%1."/>
+      <w:lvlJc w:val="left"/>
+      <w:pPr>
+        <w:ind w:left="720" w:hanging="360"/>
+      </w:pPr>
+      <w:rPr>
+        <w:rFonts w:hint="default"/>
+      </w:rPr>
+    </w:lvl>
+    <w:lvl w:ilvl="1" w:tplc="04090019" w:tentative="1">
+      <w:start w:val="1"/>
+      <w:numFmt w:val="lowerLetter"/>
+      <w:lvlText w:val="%2."/>
+      <w:lvlJc w:val="left"/>
+      <w:pPr>
+        <w:ind w:left="1440" w:hanging="360"/>
+      </w:pPr>
+    </w:lvl>
+    <w:lvl w:ilvl="2" w:tplc="0409001B" w:tentative="1">
+      <w:start w:val="1"/>
+      <w:numFmt w:val="lowerRoman"/>
+      <w:lvlText w:val="%3."/>
+      <w:lvlJc w:val="right"/>
+      <w:pPr>
+        <w:ind w:left="2160" w:hanging="180"/>
+      </w:pPr>
+    </w:lvl>
+    <w:lvl w:ilvl="3" w:tplc="0409000F" w:tentative="1">
+      <w:start w:val="1"/>
+      <w:numFmt w:val="decimal"/>
+      <w:lvlText w:val="%4."/>
+      <w:lvlJc w:val="left"/>
+      <w:pPr>
+        <w:ind w:left="2880" w:hanging="360"/>
+      </w:pPr>
+    </w:lvl>
+    <w:lvl w:ilvl="4" w:tplc="04090019" w:tentative="1">
+      <w:start w:val="1"/>
+      <w:numFmt w:val="lowerLetter"/>
+      <w:lvlText w:val="%5."/>
+      <w:lvlJc w:val="left"/>
+      <w:pPr>
+        <w:ind w:left="3600" w:hanging="360"/>
+      </w:pPr>
+    </w:lvl>
+    <w:lvl w:ilvl="5" w:tplc="0409001B" w:tentative="1">
+      <w:start w:val="1"/>
+      <w:numFmt w:val="lowerRoman"/>
+      <w:lvlText w:val="%6."/>
+      <w:lvlJc w:val="right"/>
+      <w:pPr>
+        <w:ind w:left="4320" w:hanging="180"/>
+      </w:pPr>
+    </w:lvl>
+    <w:lvl w:ilvl="6" w:tplc="0409000F" w:tentative="1">
+      <w:start w:val="1"/>
+      <w:numFmt w:val="decimal"/>
+      <w:lvlText w:val="%7."/>
+      <w:lvlJc w:val="left"/>
+      <w:pPr>
+        <w:ind w:left="5040" w:hanging="360"/>
+      </w:pPr>
+    </w:lvl>
+    <w:lvl w:ilvl="7" w:tplc="04090019" w:tentative="1">
+      <w:start w:val="1"/>
+      <w:numFmt w:val="lowerLetter"/>
+      <w:lvlText w:val="%8."/>
+      <w:lvlJc w:val="left"/>
+      <w:pPr>
+        <w:ind w:left="5760" w:hanging="360"/>
+      </w:pPr>
+    </w:lvl>
+    <w:lvl w:ilvl="8" w:tplc="0409001B" w:tentative="1">
+      <w:start w:val="1"/>
+      <w:numFmt w:val="lowerRoman"/>
+      <w:lvlText w:val="%9."/>
+      <w:lvlJc w:val="right"/>
+      <w:pPr>
+        <w:ind w:left="6480" w:hanging="180"/>
+      </w:pPr>
+    </w:lvl>
+  </w:abstractNum>
+  <w:abstractNum w:abstractNumId="3" w15:restartNumberingAfterBreak="0">
     <w:nsid w:val="1F966F6A"/>
     <w:multiLevelType w:val="multilevel"/>
     <w:tmpl w:val="18F4D250"/>
@@ -2444,7 +3926,7 @@
       </w:rPr>
     </w:lvl>
   </w:abstractNum>
-  <w:abstractNum w:abstractNumId="3" w15:restartNumberingAfterBreak="0">
+  <w:abstractNum w:abstractNumId="4" w15:restartNumberingAfterBreak="0">
     <w:nsid w:val="231214AB"/>
     <w:multiLevelType w:val="multilevel"/>
     <w:tmpl w:val="F4FE764C"/>
@@ -2543,7 +4025,7 @@
       </w:pPr>
     </w:lvl>
   </w:abstractNum>
-  <w:abstractNum w:abstractNumId="4" w15:restartNumberingAfterBreak="0">
+  <w:abstractNum w:abstractNumId="5" w15:restartNumberingAfterBreak="0">
     <w:nsid w:val="255B44FB"/>
     <w:multiLevelType w:val="multilevel"/>
     <w:tmpl w:val="F4FE764C"/>
@@ -2642,7 +4124,7 @@
       </w:pPr>
     </w:lvl>
   </w:abstractNum>
-  <w:abstractNum w:abstractNumId="5" w15:restartNumberingAfterBreak="0">
+  <w:abstractNum w:abstractNumId="6" w15:restartNumberingAfterBreak="0">
     <w:nsid w:val="387A59E4"/>
     <w:multiLevelType w:val="multilevel"/>
     <w:tmpl w:val="F4FE764C"/>
@@ -2741,7 +4223,7 @@
       </w:pPr>
     </w:lvl>
   </w:abstractNum>
-  <w:abstractNum w:abstractNumId="6" w15:restartNumberingAfterBreak="0">
+  <w:abstractNum w:abstractNumId="7" w15:restartNumberingAfterBreak="0">
     <w:nsid w:val="3D5C28D7"/>
     <w:multiLevelType w:val="hybridMultilevel"/>
     <w:tmpl w:val="9D729E18"/>
@@ -2830,7 +4312,7 @@
       </w:pPr>
     </w:lvl>
   </w:abstractNum>
-  <w:abstractNum w:abstractNumId="7" w15:restartNumberingAfterBreak="0">
+  <w:abstractNum w:abstractNumId="8" w15:restartNumberingAfterBreak="0">
     <w:nsid w:val="3F8A4DB3"/>
     <w:multiLevelType w:val="multilevel"/>
     <w:tmpl w:val="0409001F"/>
@@ -2916,7 +4398,7 @@
       </w:pPr>
     </w:lvl>
   </w:abstractNum>
-  <w:abstractNum w:abstractNumId="8" w15:restartNumberingAfterBreak="0">
+  <w:abstractNum w:abstractNumId="9" w15:restartNumberingAfterBreak="0">
     <w:nsid w:val="41687F5B"/>
     <w:multiLevelType w:val="multilevel"/>
     <w:tmpl w:val="F4FE764C"/>
@@ -3015,7 +4497,7 @@
       </w:pPr>
     </w:lvl>
   </w:abstractNum>
-  <w:abstractNum w:abstractNumId="9" w15:restartNumberingAfterBreak="0">
+  <w:abstractNum w:abstractNumId="10" w15:restartNumberingAfterBreak="0">
     <w:nsid w:val="49366135"/>
     <w:multiLevelType w:val="multilevel"/>
     <w:tmpl w:val="FBD6E996"/>
@@ -3132,7 +4614,96 @@
       </w:rPr>
     </w:lvl>
   </w:abstractNum>
-  <w:abstractNum w:abstractNumId="10" w15:restartNumberingAfterBreak="0">
+  <w:abstractNum w:abstractNumId="11" w15:restartNumberingAfterBreak="0">
+    <w:nsid w:val="4D7B36A9"/>
+    <w:multiLevelType w:val="hybridMultilevel"/>
+    <w:tmpl w:val="C8F026F2"/>
+    <w:lvl w:ilvl="0" w:tplc="0409000F">
+      <w:start w:val="1"/>
+      <w:numFmt w:val="decimal"/>
+      <w:lvlText w:val="%1."/>
+      <w:lvlJc w:val="left"/>
+      <w:pPr>
+        <w:ind w:left="720" w:hanging="360"/>
+      </w:pPr>
+      <w:rPr>
+        <w:rFonts w:hint="default"/>
+      </w:rPr>
+    </w:lvl>
+    <w:lvl w:ilvl="1" w:tplc="04090019" w:tentative="1">
+      <w:start w:val="1"/>
+      <w:numFmt w:val="lowerLetter"/>
+      <w:lvlText w:val="%2."/>
+      <w:lvlJc w:val="left"/>
+      <w:pPr>
+        <w:ind w:left="1440" w:hanging="360"/>
+      </w:pPr>
+    </w:lvl>
+    <w:lvl w:ilvl="2" w:tplc="0409001B" w:tentative="1">
+      <w:start w:val="1"/>
+      <w:numFmt w:val="lowerRoman"/>
+      <w:lvlText w:val="%3."/>
+      <w:lvlJc w:val="right"/>
+      <w:pPr>
+        <w:ind w:left="2160" w:hanging="180"/>
+      </w:pPr>
+    </w:lvl>
+    <w:lvl w:ilvl="3" w:tplc="0409000F" w:tentative="1">
+      <w:start w:val="1"/>
+      <w:numFmt w:val="decimal"/>
+      <w:lvlText w:val="%4."/>
+      <w:lvlJc w:val="left"/>
+      <w:pPr>
+        <w:ind w:left="2880" w:hanging="360"/>
+      </w:pPr>
+    </w:lvl>
+    <w:lvl w:ilvl="4" w:tplc="04090019" w:tentative="1">
+      <w:start w:val="1"/>
+      <w:numFmt w:val="lowerLetter"/>
+      <w:lvlText w:val="%5."/>
+      <w:lvlJc w:val="left"/>
+      <w:pPr>
+        <w:ind w:left="3600" w:hanging="360"/>
+      </w:pPr>
+    </w:lvl>
+    <w:lvl w:ilvl="5" w:tplc="0409001B" w:tentative="1">
+      <w:start w:val="1"/>
+      <w:numFmt w:val="lowerRoman"/>
+      <w:lvlText w:val="%6."/>
+      <w:lvlJc w:val="right"/>
+      <w:pPr>
+        <w:ind w:left="4320" w:hanging="180"/>
+      </w:pPr>
+    </w:lvl>
+    <w:lvl w:ilvl="6" w:tplc="0409000F" w:tentative="1">
+      <w:start w:val="1"/>
+      <w:numFmt w:val="decimal"/>
+      <w:lvlText w:val="%7."/>
+      <w:lvlJc w:val="left"/>
+      <w:pPr>
+        <w:ind w:left="5040" w:hanging="360"/>
+      </w:pPr>
+    </w:lvl>
+    <w:lvl w:ilvl="7" w:tplc="04090019" w:tentative="1">
+      <w:start w:val="1"/>
+      <w:numFmt w:val="lowerLetter"/>
+      <w:lvlText w:val="%8."/>
+      <w:lvlJc w:val="left"/>
+      <w:pPr>
+        <w:ind w:left="5760" w:hanging="360"/>
+      </w:pPr>
+    </w:lvl>
+    <w:lvl w:ilvl="8" w:tplc="0409001B" w:tentative="1">
+      <w:start w:val="1"/>
+      <w:numFmt w:val="lowerRoman"/>
+      <w:lvlText w:val="%9."/>
+      <w:lvlJc w:val="right"/>
+      <w:pPr>
+        <w:ind w:left="6480" w:hanging="180"/>
+      </w:pPr>
+    </w:lvl>
+  </w:abstractNum>
+  <w:abstractNum w:abstractNumId="12" w15:restartNumberingAfterBreak="0">
     <w:nsid w:val="54005522"/>
     <w:multiLevelType w:val="multilevel"/>
     <w:tmpl w:val="CB7043E2"/>
@@ -3247,7 +4818,7 @@
       </w:rPr>
     </w:lvl>
   </w:abstractNum>
-  <w:abstractNum w:abstractNumId="11" w15:restartNumberingAfterBreak="0">
+  <w:abstractNum w:abstractNumId="13" w15:restartNumberingAfterBreak="0">
     <w:nsid w:val="58B73558"/>
     <w:multiLevelType w:val="multilevel"/>
     <w:tmpl w:val="F4FE764C"/>
@@ -3346,7 +4917,7 @@
       </w:pPr>
     </w:lvl>
   </w:abstractNum>
-  <w:abstractNum w:abstractNumId="12" w15:restartNumberingAfterBreak="0">
+  <w:abstractNum w:abstractNumId="14" w15:restartNumberingAfterBreak="0">
     <w:nsid w:val="62755CB4"/>
     <w:multiLevelType w:val="hybridMultilevel"/>
     <w:tmpl w:val="E8CEBDA4"/>
@@ -3435,7 +5006,7 @@
       </w:pPr>
     </w:lvl>
   </w:abstractNum>
-  <w:abstractNum w:abstractNumId="13" w15:restartNumberingAfterBreak="0">
+  <w:abstractNum w:abstractNumId="15" w15:restartNumberingAfterBreak="0">
     <w:nsid w:val="657E6334"/>
     <w:multiLevelType w:val="hybridMultilevel"/>
     <w:tmpl w:val="FDAA27B4"/>
@@ -3521,7 +5092,7 @@
       </w:pPr>
     </w:lvl>
   </w:abstractNum>
-  <w:abstractNum w:abstractNumId="14" w15:restartNumberingAfterBreak="0">
+  <w:abstractNum w:abstractNumId="16" w15:restartNumberingAfterBreak="0">
     <w:nsid w:val="6F363C40"/>
     <w:multiLevelType w:val="multilevel"/>
     <w:tmpl w:val="F4FE764C"/>
@@ -3620,7 +5191,7 @@
       </w:pPr>
     </w:lvl>
   </w:abstractNum>
-  <w:abstractNum w:abstractNumId="15" w15:restartNumberingAfterBreak="0">
+  <w:abstractNum w:abstractNumId="17" w15:restartNumberingAfterBreak="0">
     <w:nsid w:val="74147757"/>
     <w:multiLevelType w:val="multilevel"/>
     <w:tmpl w:val="F4FE764C"/>
@@ -3719,7 +5290,224 @@
       </w:pPr>
     </w:lvl>
   </w:abstractNum>
-  <w:abstractNum w:abstractNumId="16" w15:restartNumberingAfterBreak="0">
+  <w:abstractNum w:abstractNumId="18" w15:restartNumberingAfterBreak="0">
+    <w:nsid w:val="7786271E"/>
+    <w:multiLevelType w:val="multilevel"/>
+    <w:tmpl w:val="7F64B708"/>
+    <w:lvl w:ilvl="0">
+      <w:start w:val="1"/>
+      <w:numFmt w:val="decimal"/>
+      <w:lvlText w:val="%1."/>
+      <w:lvlJc w:val="left"/>
+      <w:pPr>
+        <w:ind w:left="720" w:hanging="360"/>
+      </w:pPr>
+      <w:rPr>
+        <w:rFonts w:hint="default"/>
+        <w:sz w:val="40"/>
+        <w:szCs w:val="40"/>
+      </w:rPr>
+    </w:lvl>
+    <w:lvl w:ilvl="1">
+      <w:start w:val="1"/>
+      <w:numFmt w:val="decimal"/>
+      <w:isLgl/>
+      <w:lvlText w:val="%1.%2."/>
+      <w:lvlJc w:val="left"/>
+      <w:pPr>
+        <w:ind w:left="1440" w:hanging="1080"/>
+      </w:pPr>
+      <w:rPr>
+        <w:rFonts w:hint="default"/>
+        <w:sz w:val="32"/>
+      </w:rPr>
+    </w:lvl>
+    <w:lvl w:ilvl="2">
+      <w:start w:val="1"/>
+      <w:numFmt w:val="decimal"/>
+      <w:isLgl/>
+      <w:lvlText w:val="%1.%2.%3."/>
+      <w:lvlJc w:val="left"/>
+      <w:pPr>
+        <w:ind w:left="1800" w:hanging="1440"/>
+      </w:pPr>
+      <w:rPr>
+        <w:rFonts w:hint="default"/>
+        <w:sz w:val="32"/>
+      </w:rPr>
+    </w:lvl>
+    <w:lvl w:ilvl="3">
+      <w:start w:val="1"/>
+      <w:numFmt w:val="decimal"/>
+      <w:isLgl/>
+      <w:lvlText w:val="%1.%2.%3.%4."/>
+      <w:lvlJc w:val="left"/>
+      <w:pPr>
+        <w:ind w:left="2160" w:hanging="1800"/>
+      </w:pPr>
+      <w:rPr>
+        <w:rFonts w:hint="default"/>
+        <w:sz w:val="32"/>
+      </w:rPr>
+    </w:lvl>
+    <w:lvl w:ilvl="4">
+      <w:start w:val="1"/>
+      <w:numFmt w:val="decimal"/>
+      <w:isLgl/>
+      <w:lvlText w:val="%1.%2.%3.%4.%5."/>
+      <w:lvlJc w:val="left"/>
+      <w:pPr>
+        <w:ind w:left="2520" w:hanging="2160"/>
+      </w:pPr>
+      <w:rPr>
+        <w:rFonts w:hint="default"/>
+        <w:sz w:val="32"/>
+      </w:rPr>
+    </w:lvl>
+    <w:lvl w:ilvl="5">
+      <w:start w:val="1"/>
+      <w:numFmt w:val="decimal"/>
+      <w:isLgl/>
+      <w:lvlText w:val="%1.%2.%3.%4.%5.%6."/>
+      <w:lvlJc w:val="left"/>
+      <w:pPr>
+        <w:ind w:left="2880" w:hanging="2520"/>
+      </w:pPr>
+      <w:rPr>
+        <w:rFonts w:hint="default"/>
+        <w:sz w:val="32"/>
+      </w:rPr>
+    </w:lvl>
+    <w:lvl w:ilvl="6">
+      <w:start w:val="1"/>
+      <w:numFmt w:val="decimal"/>
+      <w:isLgl/>
+      <w:lvlText w:val="%1.%2.%3.%4.%5.%6.%7."/>
+      <w:lvlJc w:val="left"/>
+      <w:pPr>
+        <w:ind w:left="3240" w:hanging="2880"/>
+      </w:pPr>
+      <w:rPr>
+        <w:rFonts w:hint="default"/>
+        <w:sz w:val="32"/>
+      </w:rPr>
+    </w:lvl>
+    <w:lvl w:ilvl="7">
+      <w:start w:val="1"/>
+      <w:numFmt w:val="decimal"/>
+      <w:isLgl/>
+      <w:lvlText w:val="%1.%2.%3.%4.%5.%6.%7.%8."/>
+      <w:lvlJc w:val="left"/>
+      <w:pPr>
+        <w:ind w:left="3600" w:hanging="3240"/>
+      </w:pPr>
+      <w:rPr>
+        <w:rFonts w:hint="default"/>
+        <w:sz w:val="32"/>
+      </w:rPr>
+    </w:lvl>
+    <w:lvl w:ilvl="8">
+      <w:start w:val="1"/>
+      <w:numFmt w:val="decimal"/>
+      <w:isLgl/>
+      <w:lvlText w:val="%1.%2.%3.%4.%5.%6.%7.%8.%9."/>
+      <w:lvlJc w:val="left"/>
+      <w:pPr>
+        <w:ind w:left="3960" w:hanging="3600"/>
+      </w:pPr>
+      <w:rPr>
+        <w:rFonts w:hint="default"/>
+        <w:sz w:val="32"/>
+      </w:rPr>
+    </w:lvl>
+  </w:abstractNum>
+  <w:abstractNum w:abstractNumId="19" w15:restartNumberingAfterBreak="0">
+    <w:nsid w:val="78C04212"/>
+    <w:multiLevelType w:val="hybridMultilevel"/>
+    <w:tmpl w:val="BF744A7E"/>
+    <w:lvl w:ilvl="0" w:tplc="0409000F">
+      <w:start w:val="1"/>
+      <w:numFmt w:val="decimal"/>
+      <w:lvlText w:val="%1."/>
+      <w:lvlJc w:val="left"/>
+      <w:pPr>
+        <w:ind w:left="360" w:hanging="360"/>
+      </w:pPr>
+    </w:lvl>
+    <w:lvl w:ilvl="1" w:tplc="04090019" w:tentative="1">
+      <w:start w:val="1"/>
+      <w:numFmt w:val="lowerLetter"/>
+      <w:lvlText w:val="%2."/>
+      <w:lvlJc w:val="left"/>
+      <w:pPr>
+        <w:ind w:left="1080" w:hanging="360"/>
+      </w:pPr>
+    </w:lvl>
+    <w:lvl w:ilvl="2" w:tplc="0409001B" w:tentative="1">
+      <w:start w:val="1"/>
+      <w:numFmt w:val="lowerRoman"/>
+      <w:lvlText w:val="%3."/>
+      <w:lvlJc w:val="right"/>
+      <w:pPr>
+        <w:ind w:left="1800" w:hanging="180"/>
+      </w:pPr>
+    </w:lvl>
+    <w:lvl w:ilvl="3" w:tplc="0409000F" w:tentative="1">
+      <w:start w:val="1"/>
+      <w:numFmt w:val="decimal"/>
+      <w:lvlText w:val="%4."/>
+      <w:lvlJc w:val="left"/>
+      <w:pPr>
+        <w:ind w:left="2520" w:hanging="360"/>
+      </w:pPr>
+    </w:lvl>
+    <w:lvl w:ilvl="4" w:tplc="04090019" w:tentative="1">
+      <w:start w:val="1"/>
+      <w:numFmt w:val="lowerLetter"/>
+      <w:lvlText w:val="%5."/>
+      <w:lvlJc w:val="left"/>
+      <w:pPr>
+        <w:ind w:left="3240" w:hanging="360"/>
+      </w:pPr>
+    </w:lvl>
+    <w:lvl w:ilvl="5" w:tplc="0409001B" w:tentative="1">
+      <w:start w:val="1"/>
+      <w:numFmt w:val="lowerRoman"/>
+      <w:lvlText w:val="%6."/>
+      <w:lvlJc w:val="right"/>
+      <w:pPr>
+        <w:ind w:left="3960" w:hanging="180"/>
+      </w:pPr>
+    </w:lvl>
+    <w:lvl w:ilvl="6" w:tplc="0409000F" w:tentative="1">
+      <w:start w:val="1"/>
+      <w:numFmt w:val="decimal"/>
+      <w:lvlText w:val="%7."/>
+      <w:lvlJc w:val="left"/>
+      <w:pPr>
+        <w:ind w:left="4680" w:hanging="360"/>
+      </w:pPr>
+    </w:lvl>
+    <w:lvl w:ilvl="7" w:tplc="04090019" w:tentative="1">
+      <w:start w:val="1"/>
+      <w:numFmt w:val="lowerLetter"/>
+      <w:lvlText w:val="%8."/>
+      <w:lvlJc w:val="left"/>
+      <w:pPr>
+        <w:ind w:left="5400" w:hanging="360"/>
+      </w:pPr>
+    </w:lvl>
+    <w:lvl w:ilvl="8" w:tplc="0409001B" w:tentative="1">
+      <w:start w:val="1"/>
+      <w:numFmt w:val="lowerRoman"/>
+      <w:lvlText w:val="%9."/>
+      <w:lvlJc w:val="right"/>
+      <w:pPr>
+        <w:ind w:left="6120" w:hanging="180"/>
+      </w:pPr>
+    </w:lvl>
+  </w:abstractNum>
+  <w:abstractNum w:abstractNumId="20" w15:restartNumberingAfterBreak="0">
     <w:nsid w:val="7B8737DA"/>
     <w:multiLevelType w:val="multilevel"/>
     <w:tmpl w:val="F4FE764C"/>
@@ -3822,52 +5610,64 @@
     <w:abstractNumId w:val="1"/>
   </w:num>
   <w:num w:numId="2" w16cid:durableId="748845866">
-    <w:abstractNumId w:val="6"/>
+    <w:abstractNumId w:val="7"/>
   </w:num>
   <w:num w:numId="3" w16cid:durableId="818765609">
-    <w:abstractNumId w:val="13"/>
+    <w:abstractNumId w:val="15"/>
   </w:num>
   <w:num w:numId="4" w16cid:durableId="1000932016">
-    <w:abstractNumId w:val="7"/>
+    <w:abstractNumId w:val="8"/>
   </w:num>
   <w:num w:numId="5" w16cid:durableId="1108163657">
-    <w:abstractNumId w:val="12"/>
+    <w:abstractNumId w:val="14"/>
   </w:num>
   <w:num w:numId="6" w16cid:durableId="871501443">
-    <w:abstractNumId w:val="15"/>
+    <w:abstractNumId w:val="17"/>
   </w:num>
   <w:num w:numId="7" w16cid:durableId="1462188472">
     <w:abstractNumId w:val="0"/>
   </w:num>
   <w:num w:numId="8" w16cid:durableId="2118988707">
+    <w:abstractNumId w:val="12"/>
+  </w:num>
+  <w:num w:numId="9" w16cid:durableId="1609196945">
     <w:abstractNumId w:val="10"/>
   </w:num>
-  <w:num w:numId="9" w16cid:durableId="1609196945">
+  <w:num w:numId="10" w16cid:durableId="2138135553">
+    <w:abstractNumId w:val="3"/>
+  </w:num>
+  <w:num w:numId="11" w16cid:durableId="82531403">
+    <w:abstractNumId w:val="20"/>
+  </w:num>
+  <w:num w:numId="12" w16cid:durableId="2113932058">
+    <w:abstractNumId w:val="5"/>
+  </w:num>
+  <w:num w:numId="13" w16cid:durableId="597063962">
+    <w:abstractNumId w:val="6"/>
+  </w:num>
+  <w:num w:numId="14" w16cid:durableId="1133476123">
+    <w:abstractNumId w:val="13"/>
+  </w:num>
+  <w:num w:numId="15" w16cid:durableId="1718551681">
+    <w:abstractNumId w:val="16"/>
+  </w:num>
+  <w:num w:numId="16" w16cid:durableId="1547135768">
     <w:abstractNumId w:val="9"/>
   </w:num>
-  <w:num w:numId="10" w16cid:durableId="2138135553">
+  <w:num w:numId="17" w16cid:durableId="1257667012">
+    <w:abstractNumId w:val="4"/>
+  </w:num>
+  <w:num w:numId="18" w16cid:durableId="1663583913">
+    <w:abstractNumId w:val="19"/>
+  </w:num>
+  <w:num w:numId="19" w16cid:durableId="228227562">
+    <w:abstractNumId w:val="11"/>
+  </w:num>
+  <w:num w:numId="20" w16cid:durableId="1965959770">
     <w:abstractNumId w:val="2"/>
   </w:num>
-  <w:num w:numId="11" w16cid:durableId="82531403">
-    <w:abstractNumId w:val="16"/>
-  </w:num>
-  <w:num w:numId="12" w16cid:durableId="2113932058">
-    <w:abstractNumId w:val="4"/>
-  </w:num>
-  <w:num w:numId="13" w16cid:durableId="597063962">
-    <w:abstractNumId w:val="5"/>
-  </w:num>
-  <w:num w:numId="14" w16cid:durableId="1133476123">
-    <w:abstractNumId w:val="11"/>
-  </w:num>
-  <w:num w:numId="15" w16cid:durableId="1718551681">
-    <w:abstractNumId w:val="14"/>
-  </w:num>
-  <w:num w:numId="16" w16cid:durableId="1547135768">
-    <w:abstractNumId w:val="8"/>
-  </w:num>
-  <w:num w:numId="17" w16cid:durableId="1257667012">
-    <w:abstractNumId w:val="3"/>
+  <w:num w:numId="21" w16cid:durableId="2061246396">
+    <w:abstractNumId w:val="18"/>
   </w:num>
 </w:numbering>
 </file>
@@ -4300,7 +6100,6 @@
     <w:next w:val="Normal"/>
     <w:link w:val="Heading2Char"/>
     <w:uiPriority w:val="9"/>
-    <w:semiHidden/>
     <w:unhideWhenUsed/>
     <w:qFormat/>
     <w:rsid w:val="00433AEA"/>
@@ -4323,7 +6122,6 @@
     <w:next w:val="Normal"/>
     <w:link w:val="Heading3Char"/>
     <w:uiPriority w:val="9"/>
-    <w:semiHidden/>
     <w:unhideWhenUsed/>
     <w:qFormat/>
     <w:rsid w:val="00433AEA"/>
@@ -4517,7 +6315,6 @@
     <w:basedOn w:val="DefaultParagraphFont"/>
     <w:link w:val="Heading2"/>
     <w:uiPriority w:val="9"/>
-    <w:semiHidden/>
     <w:rsid w:val="00433AEA"/>
     <w:rPr>
       <w:rFonts w:asciiTheme="majorHAnsi" w:eastAsiaTheme="majorEastAsia" w:hAnsiTheme="majorHAnsi" w:cstheme="majorBidi"/>
@@ -4531,7 +6328,6 @@
     <w:basedOn w:val="DefaultParagraphFont"/>
     <w:link w:val="Heading3"/>
     <w:uiPriority w:val="9"/>
-    <w:semiHidden/>
     <w:rsid w:val="00433AEA"/>
     <w:rPr>
       <w:rFonts w:eastAsiaTheme="majorEastAsia" w:cstheme="majorBidi"/>
@@ -4832,6 +6628,74 @@
     <w:link w:val="Footer"/>
     <w:uiPriority w:val="99"/>
     <w:rsid w:val="00250DFB"/>
+  </w:style>
+  <w:style w:type="paragraph" w:styleId="TOCHeading">
+    <w:name w:val="TOC Heading"/>
+    <w:basedOn w:val="Heading1"/>
+    <w:next w:val="Normal"/>
+    <w:uiPriority w:val="39"/>
+    <w:unhideWhenUsed/>
+    <w:qFormat/>
+    <w:rsid w:val="00814A9D"/>
+    <w:pPr>
+      <w:spacing w:before="240" w:after="0" w:line="259" w:lineRule="auto"/>
+      <w:outlineLvl w:val="9"/>
+    </w:pPr>
+    <w:rPr>
+      <w:kern w:val="0"/>
+      <w:sz w:val="32"/>
+      <w:szCs w:val="32"/>
+      <w14:ligatures w14:val="none"/>
+    </w:rPr>
+  </w:style>
+  <w:style w:type="paragraph" w:styleId="TOC1">
+    <w:name w:val="toc 1"/>
+    <w:basedOn w:val="Normal"/>
+    <w:next w:val="Normal"/>
+    <w:autoRedefine/>
+    <w:uiPriority w:val="39"/>
+    <w:unhideWhenUsed/>
+    <w:rsid w:val="00E42BC7"/>
+    <w:pPr>
+      <w:spacing w:after="100"/>
+    </w:pPr>
+  </w:style>
+  <w:style w:type="paragraph" w:styleId="TOC2">
+    <w:name w:val="toc 2"/>
+    <w:basedOn w:val="Normal"/>
+    <w:next w:val="Normal"/>
+    <w:autoRedefine/>
+    <w:uiPriority w:val="39"/>
+    <w:unhideWhenUsed/>
+    <w:rsid w:val="00E42BC7"/>
+    <w:pPr>
+      <w:spacing w:after="100"/>
+      <w:ind w:left="240"/>
+    </w:pPr>
+  </w:style>
+  <w:style w:type="paragraph" w:styleId="TOC3">
+    <w:name w:val="toc 3"/>
+    <w:basedOn w:val="Normal"/>
+    <w:next w:val="Normal"/>
+    <w:autoRedefine/>
+    <w:uiPriority w:val="39"/>
+    <w:unhideWhenUsed/>
+    <w:rsid w:val="00E42BC7"/>
+    <w:pPr>
+      <w:spacing w:after="100"/>
+      <w:ind w:left="480"/>
+    </w:pPr>
+  </w:style>
+  <w:style w:type="character" w:styleId="Hyperlink">
+    <w:name w:val="Hyperlink"/>
+    <w:basedOn w:val="DefaultParagraphFont"/>
+    <w:uiPriority w:val="99"/>
+    <w:unhideWhenUsed/>
+    <w:rsid w:val="00E42BC7"/>
+    <w:rPr>
+      <w:color w:val="467886" w:themeColor="hyperlink"/>
+      <w:u w:val="single"/>
+    </w:rPr>
   </w:style>
 </w:styles>
 </file>

</xml_diff>